<commit_message>
Deploying to gh-pages from @ Morrison-Lab/mds@bc0f974b5cb016816222c5b32d8a56a23dc97e64 🚀
</commit_message>
<xml_diff>
--- a/index.docx
+++ b/index.docx
@@ -7,7 +7,7 @@
         <w:pStyle w:val="Title"/>
       </w:pPr>
       <w:r>
-        <w:t xml:space="preserve">Quarto Website Template</w:t>
+        <w:t xml:space="preserve">Math for Data Science</w:t>
       </w:r>
     </w:p>
     <w:p>
@@ -15,10 +15,10 @@
         <w:pStyle w:val="Date"/>
       </w:pPr>
       <w:r>
-        <w:t xml:space="preserve">Last modified: 2026-09-25 16:03:10 (PDT)</w:t>
+        <w:t xml:space="preserve">Last modified: 2026-09-26 00:06:52 (PDT)</w:t>
       </w:r>
     </w:p>
-    <w:bookmarkStart w:id="17" w:name="welcome"/>
+    <w:bookmarkStart w:id="11" w:name="welcome"/>
     <w:p>
       <w:pPr>
         <w:pStyle w:val="Heading1"/>
@@ -32,15 +32,13 @@
         <w:pStyle w:val="FirstParagraph"/>
       </w:pPr>
       <w:r>
-        <w:t xml:space="preserve">This is a Quarto website template that you can use to create your own website.</w:t>
-      </w:r>
-    </w:p>
-    <w:p>
-      <w:pPr>
-        <w:pStyle w:val="BodyText"/>
-      </w:pPr>
-      <w:r>
-        <w:t xml:space="preserve">The notes are available in multiple formats:</w:t>
+        <w:t xml:space="preserve">These notes collect the mathematics that data science courses assume:</w:t>
+      </w:r>
+      <w:r>
+        <w:t xml:space="preserve"> </w:t>
+      </w:r>
+      <w:r>
+        <w:t xml:space="preserve">notation, algebra, calculus, linear algebra and vector calculus.</w:t>
       </w:r>
     </w:p>
     <w:p>
@@ -51,158 +49,22 @@
           <w:numId w:val="1001"/>
         </w:numPr>
       </w:pPr>
-      <w:r>
-        <w:rPr>
-          <w:b/>
-          <w:bCs/>
-        </w:rPr>
-        <w:t xml:space="preserve">HTML Website</w:t>
-      </w:r>
-      <w:r>
-        <w:t xml:space="preserve">: Navigate using the navbar for easy access to all pages</w:t>
-      </w:r>
-    </w:p>
-    <w:p>
-      <w:pPr>
-        <w:pStyle w:val="Compact"/>
-        <w:numPr>
-          <w:ilvl w:val="0"/>
-          <w:numId w:val="1001"/>
-        </w:numPr>
-      </w:pPr>
-      <w:r>
-        <w:rPr>
-          <w:b/>
-          <w:bCs/>
-        </w:rPr>
-        <w:t xml:space="preserve">RevealJS Slides</w:t>
-      </w:r>
-      <w:r>
-        <w:t xml:space="preserve">: Each chapter can generate a presentation format with</w:t>
-      </w:r>
-      <w:r>
-        <w:t xml:space="preserve"> </w:t>
-      </w:r>
-      <w:r>
-        <w:rPr>
-          <w:rStyle w:val="VerbatimChar"/>
-        </w:rPr>
-        <w:t xml:space="preserve">-slides.html</w:t>
-      </w:r>
-      <w:r>
-        <w:t xml:space="preserve"> </w:t>
-      </w:r>
-      <w:r>
-        <w:t xml:space="preserve">suffix</w:t>
-      </w:r>
-    </w:p>
-    <w:p>
-      <w:pPr>
-        <w:pStyle w:val="Compact"/>
-        <w:numPr>
-          <w:ilvl w:val="0"/>
-          <w:numId w:val="1001"/>
-        </w:numPr>
-      </w:pPr>
-      <w:r>
-        <w:rPr>
-          <w:b/>
-          <w:bCs/>
-        </w:rPr>
-        <w:t xml:space="preserve">PDF Handouts</w:t>
-      </w:r>
-      <w:r>
-        <w:t xml:space="preserve">: Each chapter can generate a PDF handout with</w:t>
-      </w:r>
-      <w:r>
-        <w:t xml:space="preserve"> </w:t>
-      </w:r>
-      <w:r>
-        <w:rPr>
-          <w:rStyle w:val="VerbatimChar"/>
-        </w:rPr>
-        <w:t xml:space="preserve">-handout.pdf</w:t>
-      </w:r>
-      <w:r>
-        <w:t xml:space="preserve"> </w:t>
-      </w:r>
-      <w:r>
-        <w:t xml:space="preserve">suffix</w:t>
-      </w:r>
-    </w:p>
-    <w:p>
-      <w:pPr>
-        <w:pStyle w:val="Compact"/>
-        <w:numPr>
-          <w:ilvl w:val="0"/>
-          <w:numId w:val="1001"/>
-        </w:numPr>
-      </w:pPr>
-      <w:r>
-        <w:rPr>
-          <w:b/>
-          <w:bCs/>
-        </w:rPr>
-        <w:t xml:space="preserve">DOCX Documents</w:t>
-      </w:r>
-      <w:r>
-        <w:t xml:space="preserve">: Each chapter can generate a Microsoft Word document with</w:t>
-      </w:r>
-      <w:r>
-        <w:t xml:space="preserve"> </w:t>
-      </w:r>
-      <w:r>
-        <w:rPr>
-          <w:rStyle w:val="VerbatimChar"/>
-        </w:rPr>
-        <w:t xml:space="preserve">.docx</w:t>
-      </w:r>
-      <w:r>
-        <w:t xml:space="preserve"> </w:t>
-      </w:r>
-      <w:r>
-        <w:t xml:space="preserve">extension</w:t>
-      </w:r>
-    </w:p>
-    <w:bookmarkStart w:id="10" w:name="about-this-website"/>
-    <w:p>
-      <w:pPr>
-        <w:pStyle w:val="Heading2"/>
-      </w:pPr>
-      <w:r>
-        <w:t xml:space="preserve">0.1 About this website</w:t>
-      </w:r>
-    </w:p>
-    <w:p>
-      <w:pPr>
-        <w:pStyle w:val="FirstParagraph"/>
-      </w:pPr>
-      <w:r>
-        <w:t xml:space="preserve">This website is built with</w:t>
-      </w:r>
-      <w:r>
-        <w:t xml:space="preserve"> </w:t>
-      </w:r>
       <w:hyperlink r:id="rId9">
         <w:r>
           <w:rPr>
             <w:rStyle w:val="Hyperlink"/>
           </w:rPr>
-          <w:t xml:space="preserve">Quarto</w:t>
+          <w:t xml:space="preserve">Math prerequisites</w:t>
         </w:r>
       </w:hyperlink>
-      <w:r>
-        <w:t xml:space="preserve">, an open-source scientific and technical publishing system. You can use Quarto to create books, websites, blogs, presentations, and more from markdown files.</w:t>
-      </w:r>
     </w:p>
-    <w:bookmarkEnd w:id="10"/>
-    <w:bookmarkStart w:id="11" w:name="getting-started"/>
+    <w:bookmarkStart w:id="10" w:name="using-these-notes-in-another-site"/>
     <w:p>
       <w:pPr>
         <w:pStyle w:val="Heading2"/>
       </w:pPr>
       <w:r>
-        <w:t xml:space="preserve">0.2 Getting Started</w:t>
+        <w:t xml:space="preserve">0.1 Using these notes in another site</w:t>
       </w:r>
     </w:p>
     <w:p>
@@ -210,25 +72,7 @@
         <w:pStyle w:val="FirstParagraph"/>
       </w:pPr>
       <w:r>
-        <w:t xml:space="preserve">To use this template:</w:t>
-      </w:r>
-    </w:p>
-    <w:p>
-      <w:pPr>
-        <w:numPr>
-          <w:ilvl w:val="0"/>
-          <w:numId w:val="1002"/>
-        </w:numPr>
-      </w:pPr>
-      <w:r>
-        <w:rPr>
-          <w:b/>
-          <w:bCs/>
-        </w:rPr>
-        <w:t xml:space="preserve">Update the configuration</w:t>
-      </w:r>
-      <w:r>
-        <w:t xml:space="preserve">: Edit</w:t>
+        <w:t xml:space="preserve">Course sites include these notes as a git submodule named</w:t>
       </w:r>
       <w:r>
         <w:t xml:space="preserve"> </w:t>
@@ -237,31 +81,19 @@
         <w:rPr>
           <w:rStyle w:val="VerbatimChar"/>
         </w:rPr>
-        <w:t xml:space="preserve">_quarto-website.yml</w:t>
+        <w:t xml:space="preserve">mds</w:t>
       </w:r>
       <w:r>
         <w:t xml:space="preserve"> </w:t>
       </w:r>
       <w:r>
-        <w:t xml:space="preserve">to change the website title, site URL, and navigation menu.</w:t>
-      </w:r>
-    </w:p>
-    <w:p>
-      <w:pPr>
-        <w:numPr>
-          <w:ilvl w:val="0"/>
-          <w:numId w:val="1002"/>
-        </w:numPr>
-      </w:pPr>
-      <w:r>
-        <w:rPr>
-          <w:b/>
-          <w:bCs/>
-        </w:rPr>
-        <w:t xml:space="preserve">Add your content</w:t>
-      </w:r>
-      <w:r>
-        <w:t xml:space="preserve">: Create new</w:t>
+        <w:t xml:space="preserve">at the site’s root,</w:t>
+      </w:r>
+      <w:r>
+        <w:t xml:space="preserve"> </w:t>
+      </w:r>
+      <w:r>
+        <w:t xml:space="preserve">and include fragments with paths that start with</w:t>
       </w:r>
       <w:r>
         <w:t xml:space="preserve"> </w:t>
@@ -270,13 +102,16 @@
         <w:rPr>
           <w:rStyle w:val="VerbatimChar"/>
         </w:rPr>
-        <w:t xml:space="preserve">.qmd</w:t>
+        <w:t xml:space="preserve">mds/</w:t>
+      </w:r>
+      <w:r>
+        <w:t xml:space="preserve">,</w:t>
       </w:r>
       <w:r>
         <w:t xml:space="preserve"> </w:t>
       </w:r>
       <w:r>
-        <w:t xml:space="preserve">files for each page and add them to the navigation menu in</w:t>
+        <w:t xml:space="preserve">for example</w:t>
       </w:r>
       <w:r>
         <w:t xml:space="preserve"> </w:t>
@@ -285,28 +120,22 @@
         <w:rPr>
           <w:rStyle w:val="VerbatimChar"/>
         </w:rPr>
-        <w:t xml:space="preserve">_quarto-website.yml</w:t>
+        <w:t xml:space="preserve">{{&lt; include mds/_math-prereqs.qmd &gt;}}</w:t>
       </w:r>
       <w:r>
         <w:t xml:space="preserve">.</w:t>
       </w:r>
-    </w:p>
-    <w:p>
-      <w:pPr>
-        <w:numPr>
-          <w:ilvl w:val="0"/>
-          <w:numId w:val="1002"/>
-        </w:numPr>
-      </w:pPr>
-      <w:r>
-        <w:rPr>
-          <w:b/>
-          <w:bCs/>
-        </w:rPr>
-        <w:t xml:space="preserve">Customize the style</w:t>
-      </w:r>
-      <w:r>
-        <w:t xml:space="preserve">: Modify</w:t>
+      <w:r>
+        <w:t xml:space="preserve"> </w:t>
+      </w:r>
+      <w:r>
+        <w:t xml:space="preserve">This site includes its own fragments the same way,</w:t>
+      </w:r>
+      <w:r>
+        <w:t xml:space="preserve"> </w:t>
+      </w:r>
+      <w:r>
+        <w:t xml:space="preserve">through a</w:t>
       </w:r>
       <w:r>
         <w:t xml:space="preserve"> </w:t>
@@ -315,31 +144,21 @@
         <w:rPr>
           <w:rStyle w:val="VerbatimChar"/>
         </w:rPr>
-        <w:t xml:space="preserve">styles.css</w:t>
+        <w:t xml:space="preserve">mds</w:t>
       </w:r>
       <w:r>
         <w:t xml:space="preserve"> </w:t>
       </w:r>
       <w:r>
-        <w:t xml:space="preserve">to change the appearance of your website.</w:t>
+        <w:t xml:space="preserve">symlink that points at the repository root.</w:t>
       </w:r>
     </w:p>
     <w:p>
       <w:pPr>
-        <w:numPr>
-          <w:ilvl w:val="0"/>
-          <w:numId w:val="1002"/>
-        </w:numPr>
-      </w:pPr>
-      <w:r>
-        <w:rPr>
-          <w:b/>
-          <w:bCs/>
-        </w:rPr>
-        <w:t xml:space="preserve">Add references</w:t>
-      </w:r>
-      <w:r>
-        <w:t xml:space="preserve">: Update</w:t>
+        <w:pStyle w:val="BodyText"/>
+      </w:pPr>
+      <w:r>
+        <w:t xml:space="preserve">Quarto resolves</w:t>
       </w:r>
       <w:r>
         <w:t xml:space="preserve"> </w:t>
@@ -348,81 +167,25 @@
         <w:rPr>
           <w:rStyle w:val="VerbatimChar"/>
         </w:rPr>
-        <w:t xml:space="preserve">references.bib</w:t>
+        <w:t xml:space="preserve">@id</w:t>
       </w:r>
       <w:r>
         <w:t xml:space="preserve"> </w:t>
       </w:r>
       <w:r>
-        <w:t xml:space="preserve">with your citations.</w:t>
-      </w:r>
-    </w:p>
-    <w:bookmarkEnd w:id="11"/>
-    <w:bookmarkStart w:id="12" w:name="building-the-website"/>
-    <w:p>
-      <w:pPr>
-        <w:pStyle w:val="Heading2"/>
-      </w:pPr>
-      <w:r>
-        <w:t xml:space="preserve">0.3 Building the website</w:t>
-      </w:r>
-    </w:p>
-    <w:p>
-      <w:pPr>
-        <w:pStyle w:val="FirstParagraph"/>
-      </w:pPr>
-      <w:r>
-        <w:t xml:space="preserve">To render the website locally:</w:t>
-      </w:r>
-    </w:p>
-    <w:p>
-      <w:pPr>
-        <w:pStyle w:val="SourceCode"/>
-      </w:pPr>
-      <w:r>
-        <w:rPr>
-          <w:rStyle w:val="ExtensionTok"/>
-        </w:rPr>
-        <w:t xml:space="preserve">quarto</w:t>
-      </w:r>
-      <w:r>
-        <w:rPr>
-          <w:rStyle w:val="NormalTok"/>
-        </w:rPr>
-        <w:t xml:space="preserve"> render</w:t>
-      </w:r>
-    </w:p>
-    <w:p>
-      <w:pPr>
-        <w:pStyle w:val="FirstParagraph"/>
-      </w:pPr>
-      <w:r>
-        <w:t xml:space="preserve">To preview the website with live reload:</w:t>
-      </w:r>
-    </w:p>
-    <w:p>
-      <w:pPr>
-        <w:pStyle w:val="SourceCode"/>
-      </w:pPr>
-      <w:r>
-        <w:rPr>
-          <w:rStyle w:val="ExtensionTok"/>
-        </w:rPr>
-        <w:t xml:space="preserve">quarto</w:t>
-      </w:r>
-      <w:r>
-        <w:rPr>
-          <w:rStyle w:val="NormalTok"/>
-        </w:rPr>
-        <w:t xml:space="preserve"> preview</w:t>
-      </w:r>
-    </w:p>
-    <w:p>
-      <w:pPr>
-        <w:pStyle w:val="FirstParagraph"/>
-      </w:pPr>
-      <w:r>
-        <w:t xml:space="preserve">The rendered output will be in the</w:t>
+        <w:t xml:space="preserve">cross-references only within one rendered page,</w:t>
+      </w:r>
+      <w:r>
+        <w:t xml:space="preserve"> </w:t>
+      </w:r>
+      <w:r>
+        <w:t xml:space="preserve">so a host site that links to a result here</w:t>
+      </w:r>
+      <w:r>
+        <w:t xml:space="preserve"> </w:t>
+      </w:r>
+      <w:r>
+        <w:t xml:space="preserve">uses an explicit link,</w:t>
       </w:r>
       <w:r>
         <w:t xml:space="preserve"> </w:t>
@@ -431,177 +194,14 @@
         <w:rPr>
           <w:rStyle w:val="VerbatimChar"/>
         </w:rPr>
-        <w:t xml:space="preserve">_site/</w:t>
-      </w:r>
-      <w:r>
-        <w:t xml:space="preserve"> </w:t>
-      </w:r>
-      <w:r>
-        <w:t xml:space="preserve">directory, which can be published to GitHub Pages.</w:t>
+        <w:t xml:space="preserve">[text](math-prereqs.qmd#id)</w:t>
+      </w:r>
+      <w:r>
+        <w:t xml:space="preserve">.</w:t>
       </w:r>
     </w:p>
-    <w:bookmarkEnd w:id="12"/>
-    <w:bookmarkStart w:id="13" w:name="publishing-to-github-pages"/>
-    <w:p>
-      <w:pPr>
-        <w:pStyle w:val="Heading2"/>
-      </w:pPr>
-      <w:r>
-        <w:t xml:space="preserve">0.4 Publishing to GitHub Pages</w:t>
-      </w:r>
-    </w:p>
-    <w:p>
-      <w:pPr>
-        <w:pStyle w:val="FirstParagraph"/>
-      </w:pPr>
-      <w:r>
-        <w:t xml:space="preserve">This template includes a GitHub Actions workflow that automatically builds and publishes your website to GitHub Pages when you push to the main branch.</w:t>
-      </w:r>
-    </w:p>
-    <w:p>
-      <w:pPr>
-        <w:pStyle w:val="BodyText"/>
-      </w:pPr>
-      <w:r>
-        <w:t xml:space="preserve">To enable GitHub Pages:</w:t>
-      </w:r>
-    </w:p>
-    <w:p>
-      <w:pPr>
-        <w:pStyle w:val="Compact"/>
-        <w:numPr>
-          <w:ilvl w:val="0"/>
-          <w:numId w:val="1003"/>
-        </w:numPr>
-      </w:pPr>
-      <w:r>
-        <w:t xml:space="preserve">Go to your repository settings</w:t>
-      </w:r>
-    </w:p>
-    <w:p>
-      <w:pPr>
-        <w:pStyle w:val="Compact"/>
-        <w:numPr>
-          <w:ilvl w:val="0"/>
-          <w:numId w:val="1003"/>
-        </w:numPr>
-      </w:pPr>
-      <w:r>
-        <w:t xml:space="preserve">Navigate to</w:t>
-      </w:r>
-      <w:r>
-        <w:t xml:space="preserve"> </w:t>
-      </w:r>
-      <w:r>
-        <w:t xml:space="preserve">“Pages”</w:t>
-      </w:r>
-      <w:r>
-        <w:t xml:space="preserve"> </w:t>
-      </w:r>
-      <w:r>
-        <w:t xml:space="preserve">in the left sidebar</w:t>
-      </w:r>
-    </w:p>
-    <w:p>
-      <w:pPr>
-        <w:pStyle w:val="Compact"/>
-        <w:numPr>
-          <w:ilvl w:val="0"/>
-          <w:numId w:val="1003"/>
-        </w:numPr>
-      </w:pPr>
-      <w:r>
-        <w:t xml:space="preserve">Under</w:t>
-      </w:r>
-      <w:r>
-        <w:t xml:space="preserve"> </w:t>
-      </w:r>
-      <w:r>
-        <w:t xml:space="preserve">“Build and deployment”</w:t>
-      </w:r>
-      <w:r>
-        <w:t xml:space="preserve">, set Source to</w:t>
-      </w:r>
-      <w:r>
-        <w:t xml:space="preserve"> </w:t>
-      </w:r>
-      <w:r>
-        <w:t xml:space="preserve">“GitHub Actions”</w:t>
-      </w:r>
-    </w:p>
-    <w:p>
-      <w:pPr>
-        <w:pStyle w:val="Compact"/>
-        <w:numPr>
-          <w:ilvl w:val="0"/>
-          <w:numId w:val="1003"/>
-        </w:numPr>
-      </w:pPr>
-      <w:r>
-        <w:t xml:space="preserve">Push your changes to the main branch</w:t>
-      </w:r>
-    </w:p>
-    <w:p>
-      <w:pPr>
-        <w:pStyle w:val="Compact"/>
-        <w:numPr>
-          <w:ilvl w:val="0"/>
-          <w:numId w:val="1003"/>
-        </w:numPr>
-      </w:pPr>
-      <w:r>
-        <w:t xml:space="preserve">The workflow will automatically build and deploy your website</w:t>
-      </w:r>
-    </w:p>
-    <w:p>
-      <w:pPr>
-        <w:pStyle w:val="FirstParagraph"/>
-      </w:pPr>
-      <w:r>
-        <w:t xml:space="preserve">Your website will be available at</w:t>
-      </w:r>
-      <w:r>
-        <w:t xml:space="preserve"> </w:t>
-      </w:r>
-      <w:r>
-        <w:rPr>
-          <w:rStyle w:val="VerbatimChar"/>
-        </w:rPr>
-        <w:t xml:space="preserve">https://YOUR-USERNAME.github.io/YOUR-REPO/</w:t>
-      </w:r>
-    </w:p>
-    <w:bookmarkEnd w:id="13"/>
-    <w:bookmarkStart w:id="14" w:name="license"/>
-    <w:p>
-      <w:pPr>
-        <w:pStyle w:val="Heading2"/>
-      </w:pPr>
-      <w:r>
-        <w:t xml:space="preserve">0.5 License</w:t>
-      </w:r>
-    </w:p>
-    <w:p>
-      <w:pPr>
-        <w:pStyle w:val="FirstParagraph"/>
-      </w:pPr>
-      <w:r>
-        <w:t xml:space="preserve">Add your license information here.</w:t>
-      </w:r>
-    </w:p>
-    <w:bookmarkEnd w:id="14"/>
-    <w:bookmarkStart w:id="16" w:name="references"/>
-    <w:p>
-      <w:pPr>
-        <w:pStyle w:val="Heading2"/>
-      </w:pPr>
-      <w:r>
-        <w:t xml:space="preserve">References</w:t>
-      </w:r>
-    </w:p>
-    <w:bookmarkStart w:id="15" w:name="refs"/>
-    <w:bookmarkEnd w:id="15"/>
-    <w:bookmarkEnd w:id="16"/>
-    <w:bookmarkEnd w:id="17"/>
+    <w:bookmarkEnd w:id="10"/>
+    <w:bookmarkEnd w:id="11"/>
     <w:sectPr>
       <w:footnotePr>
         <w:numRestart w:val="eachSect"/>
@@ -815,156 +415,11 @@
       </w:rPr>
     </w:lvl>
   </w:abstractNum>
-  <w:abstractNum w:abstractNumId="99411">
-    <w:nsid w:val="00A99411"/>
-    <w:multiLevelType w:val="multilevel"/>
-    <w:lvl w:ilvl="0">
-      <w:start w:val="1"/>
-      <w:numFmt w:val="decimal"/>
-      <w:lvlText w:val="%1."/>
-      <w:lvlJc w:val="left"/>
-      <w:pPr>
-        <w:ind w:left="720" w:hanging="360"/>
-      </w:pPr>
-    </w:lvl>
-    <w:lvl w:ilvl="1">
-      <w:start w:val="1"/>
-      <w:numFmt w:val="decimal"/>
-      <w:lvlText w:val="%2."/>
-      <w:lvlJc w:val="left"/>
-      <w:pPr>
-        <w:ind w:left="1440" w:hanging="360"/>
-      </w:pPr>
-    </w:lvl>
-    <w:lvl w:ilvl="2">
-      <w:start w:val="1"/>
-      <w:numFmt w:val="decimal"/>
-      <w:lvlText w:val="%3."/>
-      <w:lvlJc w:val="left"/>
-      <w:pPr>
-        <w:ind w:left="2160" w:hanging="360"/>
-      </w:pPr>
-    </w:lvl>
-    <w:lvl w:ilvl="3">
-      <w:start w:val="1"/>
-      <w:numFmt w:val="decimal"/>
-      <w:lvlText w:val="%4."/>
-      <w:lvlJc w:val="left"/>
-      <w:pPr>
-        <w:ind w:left="2880" w:hanging="360"/>
-      </w:pPr>
-    </w:lvl>
-    <w:lvl w:ilvl="4">
-      <w:start w:val="1"/>
-      <w:numFmt w:val="decimal"/>
-      <w:lvlText w:val="%5."/>
-      <w:lvlJc w:val="left"/>
-      <w:pPr>
-        <w:ind w:left="3600" w:hanging="360"/>
-      </w:pPr>
-    </w:lvl>
-    <w:lvl w:ilvl="5">
-      <w:start w:val="1"/>
-      <w:numFmt w:val="decimal"/>
-      <w:lvlText w:val="%6."/>
-      <w:lvlJc w:val="left"/>
-      <w:pPr>
-        <w:ind w:left="4320" w:hanging="360"/>
-      </w:pPr>
-    </w:lvl>
-    <w:lvl w:ilvl="6">
-      <w:start w:val="1"/>
-      <w:numFmt w:val="decimal"/>
-      <w:lvlText w:val="%7."/>
-      <w:lvlJc w:val="left"/>
-      <w:pPr>
-        <w:ind w:left="5040" w:hanging="360"/>
-      </w:pPr>
-    </w:lvl>
-    <w:lvl w:ilvl="7">
-      <w:start w:val="1"/>
-      <w:numFmt w:val="decimal"/>
-      <w:lvlText w:val="%8."/>
-      <w:lvlJc w:val="left"/>
-      <w:pPr>
-        <w:ind w:left="5760" w:hanging="360"/>
-      </w:pPr>
-    </w:lvl>
-    <w:lvl w:ilvl="8">
-      <w:start w:val="1"/>
-      <w:numFmt w:val="decimal"/>
-      <w:lvlText w:val="%9."/>
-      <w:lvlJc w:val="left"/>
-      <w:pPr>
-        <w:ind w:left="6480" w:hanging="360"/>
-      </w:pPr>
-    </w:lvl>
-  </w:abstractNum>
   <w:num w:numId="1000">
     <w:abstractNumId w:val="990"/>
   </w:num>
   <w:num w:numId="1001">
     <w:abstractNumId w:val="991"/>
-  </w:num>
-  <w:num w:numId="1002">
-    <w:abstractNumId w:val="99411"/>
-    <w:lvlOverride w:ilvl="0">
-      <w:startOverride w:val="1"/>
-    </w:lvlOverride>
-    <w:lvlOverride w:ilvl="1">
-      <w:startOverride w:val="1"/>
-    </w:lvlOverride>
-    <w:lvlOverride w:ilvl="2">
-      <w:startOverride w:val="1"/>
-    </w:lvlOverride>
-    <w:lvlOverride w:ilvl="3">
-      <w:startOverride w:val="1"/>
-    </w:lvlOverride>
-    <w:lvlOverride w:ilvl="4">
-      <w:startOverride w:val="1"/>
-    </w:lvlOverride>
-    <w:lvlOverride w:ilvl="5">
-      <w:startOverride w:val="1"/>
-    </w:lvlOverride>
-    <w:lvlOverride w:ilvl="6">
-      <w:startOverride w:val="1"/>
-    </w:lvlOverride>
-    <w:lvlOverride w:ilvl="7">
-      <w:startOverride w:val="1"/>
-    </w:lvlOverride>
-    <w:lvlOverride w:ilvl="8">
-      <w:startOverride w:val="1"/>
-    </w:lvlOverride>
-  </w:num>
-  <w:num w:numId="1003">
-    <w:abstractNumId w:val="99411"/>
-    <w:lvlOverride w:ilvl="0">
-      <w:startOverride w:val="1"/>
-    </w:lvlOverride>
-    <w:lvlOverride w:ilvl="1">
-      <w:startOverride w:val="1"/>
-    </w:lvlOverride>
-    <w:lvlOverride w:ilvl="2">
-      <w:startOverride w:val="1"/>
-    </w:lvlOverride>
-    <w:lvlOverride w:ilvl="3">
-      <w:startOverride w:val="1"/>
-    </w:lvlOverride>
-    <w:lvlOverride w:ilvl="4">
-      <w:startOverride w:val="1"/>
-    </w:lvlOverride>
-    <w:lvlOverride w:ilvl="5">
-      <w:startOverride w:val="1"/>
-    </w:lvlOverride>
-    <w:lvlOverride w:ilvl="6">
-      <w:startOverride w:val="1"/>
-    </w:lvlOverride>
-    <w:lvlOverride w:ilvl="7">
-      <w:startOverride w:val="1"/>
-    </w:lvlOverride>
-    <w:lvlOverride w:ilvl="8">
-      <w:startOverride w:val="1"/>
-    </w:lvlOverride>
   </w:num>
 </w:numbering>
 </file>

</xml_diff>

<commit_message>
Deploying to gh-pages from @ Morrison-Lab/mds@26cde5a4a4b3d6b70a01e8163fdd9da889da958f 🚀
</commit_message>
<xml_diff>
--- a/index.docx
+++ b/index.docx
@@ -15,13 +15,13 @@
         <w:pStyle w:val="Date"/>
       </w:pPr>
       <w:r>
-        <w:t xml:space="preserve">Last modified: 2026-09-28 01:24:51 (PDT)</w:t>
+        <w:t xml:space="preserve">Last modified: 2026-09-28 03:24:06 (PDT)</w:t>
       </w:r>
     </w:p>
-    <w:bookmarkStart w:id="11" w:name="welcome"/>
+    <w:bookmarkStart w:id="15" w:name="welcome"/>
     <w:p>
       <w:pPr>
-        <w:pStyle w:val="Heading1"/>
+        <w:pStyle w:val="Heading2"/>
       </w:pPr>
       <w:r>
         <w:t xml:space="preserve">Welcome</w:t>
@@ -29,16 +29,74 @@
     </w:p>
     <w:p>
       <w:pPr>
+        <w:pStyle w:val="BlockText"/>
+      </w:pPr>
+      <w:r>
+        <w:t xml:space="preserve">Math is not just a way of calculating numerical answers;</w:t>
+      </w:r>
+      <w:r>
+        <w:t xml:space="preserve"> </w:t>
+      </w:r>
+      <w:r>
+        <w:t xml:space="preserve">it is a way of thinking,</w:t>
+      </w:r>
+      <w:r>
+        <w:t xml:space="preserve"> </w:t>
+      </w:r>
+      <w:r>
+        <w:t xml:space="preserve">using clear definitions for concepts and rigorous logic</w:t>
+      </w:r>
+      <w:r>
+        <w:t xml:space="preserve"> </w:t>
+      </w:r>
+      <w:r>
+        <w:t xml:space="preserve">to organize our thoughts and back up our assertions.</w:t>
+      </w:r>
+    </w:p>
+    <w:p>
+      <w:pPr>
         <w:pStyle w:val="FirstParagraph"/>
       </w:pPr>
       <w:r>
+        <w:t xml:space="preserve">Cheng (2025)</w:t>
+      </w:r>
+    </w:p>
+    <w:p>
+      <w:pPr>
+        <w:pStyle w:val="BodyText"/>
+      </w:pPr>
+      <w:r>
         <w:t xml:space="preserve">These notes collect the mathematics that data science courses assume:</w:t>
       </w:r>
       <w:r>
         <w:t xml:space="preserve"> </w:t>
       </w:r>
       <w:r>
-        <w:t xml:space="preserve">notation, algebra, calculus, linear algebra and vector calculus.</w:t>
+        <w:t xml:space="preserve">mathematical notation, algebra</w:t>
+      </w:r>
+      <w:r>
+        <w:t xml:space="preserve"> </w:t>
+      </w:r>
+      <w:r>
+        <w:t xml:space="preserve">(including exponentials and logarithms),</w:t>
+      </w:r>
+      <w:r>
+        <w:t xml:space="preserve"> </w:t>
+      </w:r>
+      <w:r>
+        <w:t xml:space="preserve">univariate calculus, linear algebra, vector calculus, and proof writing.</w:t>
+      </w:r>
+      <w:r>
+        <w:t xml:space="preserve"> </w:t>
+      </w:r>
+      <w:r>
+        <w:t xml:space="preserve">Some key results are listed here,</w:t>
+      </w:r>
+      <w:r>
+        <w:t xml:space="preserve"> </w:t>
+      </w:r>
+      <w:r>
+        <w:t xml:space="preserve">organized by topic:</w:t>
       </w:r>
     </w:p>
     <w:p>
@@ -54,17 +112,187 @@
           <w:rPr>
             <w:rStyle w:val="Hyperlink"/>
           </w:rPr>
-          <w:t xml:space="preserve">Math prerequisites</w:t>
+          <w:t xml:space="preserve">Notation</w:t>
         </w:r>
       </w:hyperlink>
+      <w:r>
+        <w:t xml:space="preserve">:</w:t>
+      </w:r>
+      <w:r>
+        <w:t xml:space="preserve"> </w:t>
+      </w:r>
+      <w:r>
+        <w:t xml:space="preserve">common symbols, natural numbers, the percent sign,</w:t>
+      </w:r>
+      <w:r>
+        <w:t xml:space="preserve"> </w:t>
+      </w:r>
+      <w:r>
+        <w:t xml:space="preserve">proof symbols, and indicator functions</w:t>
+      </w:r>
     </w:p>
-    <w:bookmarkStart w:id="10" w:name="using-these-notes-in-another-site"/>
     <w:p>
       <w:pPr>
+        <w:pStyle w:val="Compact"/>
+        <w:numPr>
+          <w:ilvl w:val="0"/>
+          <w:numId w:val="1001"/>
+        </w:numPr>
+      </w:pPr>
+      <w:hyperlink r:id="rId10">
+        <w:r>
+          <w:rPr>
+            <w:rStyle w:val="Hyperlink"/>
+          </w:rPr>
+          <w:t xml:space="preserve">Algebra</w:t>
+        </w:r>
+      </w:hyperlink>
+      <w:r>
+        <w:t xml:space="preserve">:</w:t>
+      </w:r>
+      <w:r>
+        <w:t xml:space="preserve"> </w:t>
+      </w:r>
+      <w:r>
+        <w:t xml:space="preserve">equalities and inequalities, infimum and supremum,</w:t>
+      </w:r>
+      <w:r>
+        <w:t xml:space="preserve"> </w:t>
+      </w:r>
+      <w:r>
+        <w:t xml:space="preserve">sums, products, quotients, exponentials and logarithms</w:t>
+      </w:r>
+    </w:p>
+    <w:p>
+      <w:pPr>
+        <w:pStyle w:val="Compact"/>
+        <w:numPr>
+          <w:ilvl w:val="0"/>
+          <w:numId w:val="1001"/>
+        </w:numPr>
+      </w:pPr>
+      <w:hyperlink r:id="rId11">
+        <w:r>
+          <w:rPr>
+            <w:rStyle w:val="Hyperlink"/>
+          </w:rPr>
+          <w:t xml:space="preserve">Calculus</w:t>
+        </w:r>
+      </w:hyperlink>
+      <w:r>
+        <w:t xml:space="preserve">:</w:t>
+      </w:r>
+      <w:r>
+        <w:t xml:space="preserve"> </w:t>
+      </w:r>
+      <w:r>
+        <w:t xml:space="preserve">derivative rules, antiderivatives, regularity conditions,</w:t>
+      </w:r>
+      <w:r>
+        <w:t xml:space="preserve"> </w:t>
+      </w:r>
+      <w:r>
+        <w:t xml:space="preserve">the Fundamental Theorem of Calculus, and double integrals</w:t>
+      </w:r>
+    </w:p>
+    <w:p>
+      <w:pPr>
+        <w:pStyle w:val="Compact"/>
+        <w:numPr>
+          <w:ilvl w:val="0"/>
+          <w:numId w:val="1001"/>
+        </w:numPr>
+      </w:pPr>
+      <w:hyperlink r:id="rId12">
+        <w:r>
+          <w:rPr>
+            <w:rStyle w:val="Hyperlink"/>
+          </w:rPr>
+          <w:t xml:space="preserve">Linear Algebra</w:t>
+        </w:r>
+      </w:hyperlink>
+      <w:r>
+        <w:t xml:space="preserve">:</w:t>
+      </w:r>
+      <w:r>
+        <w:t xml:space="preserve"> </w:t>
+      </w:r>
+      <w:r>
+        <w:t xml:space="preserve">vectors, matrices and their operations, special matrices,</w:t>
+      </w:r>
+      <w:r>
+        <w:t xml:space="preserve"> </w:t>
+      </w:r>
+      <w:r>
+        <w:t xml:space="preserve">quadratic forms, and the design matrix</w:t>
+      </w:r>
+    </w:p>
+    <w:p>
+      <w:pPr>
+        <w:pStyle w:val="Compact"/>
+        <w:numPr>
+          <w:ilvl w:val="0"/>
+          <w:numId w:val="1001"/>
+        </w:numPr>
+      </w:pPr>
+      <w:hyperlink r:id="rId13">
+        <w:r>
+          <w:rPr>
+            <w:rStyle w:val="Hyperlink"/>
+          </w:rPr>
+          <w:t xml:space="preserve">Vector Calculus</w:t>
+        </w:r>
+      </w:hyperlink>
+      <w:r>
+        <w:t xml:space="preserve">:</w:t>
+      </w:r>
+      <w:r>
+        <w:t xml:space="preserve"> </w:t>
+      </w:r>
+      <w:r>
+        <w:t xml:space="preserve">derivatives with respect to vectors and matrices,</w:t>
+      </w:r>
+      <w:r>
+        <w:t xml:space="preserve"> </w:t>
+      </w:r>
+      <w:r>
+        <w:t xml:space="preserve">quadratic forms, and the vector chain rule</w:t>
+      </w:r>
+    </w:p>
+    <w:p>
+      <w:pPr>
+        <w:pStyle w:val="Compact"/>
+        <w:numPr>
+          <w:ilvl w:val="0"/>
+          <w:numId w:val="1001"/>
+        </w:numPr>
+      </w:pPr>
+      <w:hyperlink r:id="rId14">
+        <w:r>
+          <w:rPr>
+            <w:rStyle w:val="Hyperlink"/>
+          </w:rPr>
+          <w:t xml:space="preserve">Proof Writing</w:t>
+        </w:r>
+      </w:hyperlink>
+      <w:r>
+        <w:t xml:space="preserve">:</w:t>
+      </w:r>
+      <w:r>
+        <w:t xml:space="preserve"> </w:t>
+      </w:r>
+      <w:r>
+        <w:t xml:space="preserve">showing and annotating every step of a derivation</w:t>
+      </w:r>
+    </w:p>
+    <w:bookmarkEnd w:id="15"/>
+    <w:bookmarkStart w:id="16" w:name="using-these-notes-in-another-site"/>
+    <w:p>
+      <w:pPr>
         <w:pStyle w:val="Heading2"/>
       </w:pPr>
       <w:r>
-        <w:t xml:space="preserve">0.1 Using these notes in another site</w:t>
+        <w:t xml:space="preserve">Using these notes in another site</w:t>
       </w:r>
     </w:p>
     <w:p>
@@ -120,7 +348,7 @@
         <w:rPr>
           <w:rStyle w:val="VerbatimChar"/>
         </w:rPr>
-        <w:t xml:space="preserve">{{&lt; include mds/_math-prereqs.qmd &gt;}}</w:t>
+        <w:t xml:space="preserve">{{&lt; include mds/_notation.qmd &gt;}}</w:t>
       </w:r>
       <w:r>
         <w:t xml:space="preserve">.</w:t>
@@ -158,6 +386,349 @@
         <w:pStyle w:val="BodyText"/>
       </w:pPr>
       <w:r>
+        <w:t xml:space="preserve">Each page is a thin wrapper around one or more fragments:</w:t>
+      </w:r>
+    </w:p>
+    <w:tbl>
+      <w:tblPr>
+        <w:tblStyle w:val="Table"/>
+        <w:tblW w:type="pct" w:w="5000"/>
+        <w:tblLayout w:type="fixed"/>
+        <w:tblLook w:firstRow="1" w:lastRow="0" w:firstColumn="0" w:lastColumn="0" w:noHBand="0" w:noVBand="0" w:val="0020"/>
+      </w:tblPr>
+      <w:tblGrid>
+        <w:gridCol w:w="1584"/>
+        <w:gridCol w:w="6336"/>
+      </w:tblGrid>
+      <w:tr>
+        <w:trPr>
+          <w:tblHeader w:val="on"/>
+        </w:trPr>
+        <w:tc>
+          <w:tcPr/>
+          <w:p>
+            <w:pPr>
+              <w:pStyle w:val="Compact"/>
+            </w:pPr>
+            <w:r>
+              <w:t xml:space="preserve">Page</w:t>
+            </w:r>
+          </w:p>
+        </w:tc>
+        <w:tc>
+          <w:tcPr/>
+          <w:p>
+            <w:pPr>
+              <w:pStyle w:val="Compact"/>
+            </w:pPr>
+            <w:r>
+              <w:t xml:space="preserve">Fragment(s) to include</w:t>
+            </w:r>
+          </w:p>
+        </w:tc>
+      </w:tr>
+      <w:tr>
+        <w:tc>
+          <w:tcPr/>
+          <w:p>
+            <w:pPr>
+              <w:pStyle w:val="Compact"/>
+            </w:pPr>
+            <w:hyperlink r:id="rId9">
+              <w:r>
+                <w:rPr>
+                  <w:rStyle w:val="Hyperlink"/>
+                </w:rPr>
+                <w:t xml:space="preserve">Notation</w:t>
+              </w:r>
+            </w:hyperlink>
+          </w:p>
+        </w:tc>
+        <w:tc>
+          <w:tcPr/>
+          <w:p>
+            <w:pPr>
+              <w:pStyle w:val="Compact"/>
+            </w:pPr>
+            <w:r>
+              <w:rPr>
+                <w:rStyle w:val="VerbatimChar"/>
+              </w:rPr>
+              <w:t xml:space="preserve">mds/_notation.qmd</w:t>
+            </w:r>
+          </w:p>
+        </w:tc>
+      </w:tr>
+      <w:tr>
+        <w:tc>
+          <w:tcPr/>
+          <w:p>
+            <w:pPr>
+              <w:pStyle w:val="Compact"/>
+            </w:pPr>
+            <w:hyperlink r:id="rId10">
+              <w:r>
+                <w:rPr>
+                  <w:rStyle w:val="Hyperlink"/>
+                </w:rPr>
+                <w:t xml:space="preserve">Algebra</w:t>
+              </w:r>
+            </w:hyperlink>
+          </w:p>
+        </w:tc>
+        <w:tc>
+          <w:tcPr/>
+          <w:p>
+            <w:pPr>
+              <w:pStyle w:val="Compact"/>
+            </w:pPr>
+            <w:r>
+              <w:rPr>
+                <w:rStyle w:val="VerbatimChar"/>
+              </w:rPr>
+              <w:t xml:space="preserve">mds/_algebra.qmd</w:t>
+            </w:r>
+          </w:p>
+        </w:tc>
+      </w:tr>
+      <w:tr>
+        <w:tc>
+          <w:tcPr/>
+          <w:p>
+            <w:pPr>
+              <w:pStyle w:val="Compact"/>
+            </w:pPr>
+            <w:hyperlink r:id="rId11">
+              <w:r>
+                <w:rPr>
+                  <w:rStyle w:val="Hyperlink"/>
+                </w:rPr>
+                <w:t xml:space="preserve">Calculus</w:t>
+              </w:r>
+            </w:hyperlink>
+          </w:p>
+        </w:tc>
+        <w:tc>
+          <w:tcPr/>
+          <w:p>
+            <w:pPr>
+              <w:pStyle w:val="Compact"/>
+            </w:pPr>
+            <w:r>
+              <w:rPr>
+                <w:rStyle w:val="VerbatimChar"/>
+              </w:rPr>
+              <w:t xml:space="preserve">mds/_calc-derivatives.qmd</w:t>
+            </w:r>
+            <w:r>
+              <w:t xml:space="preserve">,</w:t>
+            </w:r>
+            <w:r>
+              <w:t xml:space="preserve"> </w:t>
+            </w:r>
+            <w:r>
+              <w:rPr>
+                <w:rStyle w:val="VerbatimChar"/>
+              </w:rPr>
+              <w:t xml:space="preserve">mds/_calc-integrals.qmd</w:t>
+            </w:r>
+            <w:r>
+              <w:t xml:space="preserve">, and the double-integral subfiles</w:t>
+            </w:r>
+            <w:r>
+              <w:t xml:space="preserve"> </w:t>
+            </w:r>
+            <w:r>
+              <w:rPr>
+                <w:rStyle w:val="VerbatimChar"/>
+              </w:rPr>
+              <w:t xml:space="preserve">mds/_subfiles/_*fubini*.qmd</w:t>
+            </w:r>
+          </w:p>
+        </w:tc>
+      </w:tr>
+      <w:tr>
+        <w:tc>
+          <w:tcPr/>
+          <w:p>
+            <w:pPr>
+              <w:pStyle w:val="Compact"/>
+            </w:pPr>
+            <w:hyperlink r:id="rId12">
+              <w:r>
+                <w:rPr>
+                  <w:rStyle w:val="Hyperlink"/>
+                </w:rPr>
+                <w:t xml:space="preserve">Linear Algebra</w:t>
+              </w:r>
+            </w:hyperlink>
+          </w:p>
+        </w:tc>
+        <w:tc>
+          <w:tcPr/>
+          <w:p>
+            <w:pPr>
+              <w:pStyle w:val="Compact"/>
+            </w:pPr>
+            <w:r>
+              <w:rPr>
+                <w:rStyle w:val="VerbatimChar"/>
+              </w:rPr>
+              <w:t xml:space="preserve">mds/_subfiles/_sec_linear_algebra.qmd</w:t>
+            </w:r>
+          </w:p>
+        </w:tc>
+      </w:tr>
+      <w:tr>
+        <w:tc>
+          <w:tcPr/>
+          <w:p>
+            <w:pPr>
+              <w:pStyle w:val="Compact"/>
+            </w:pPr>
+            <w:hyperlink r:id="rId13">
+              <w:r>
+                <w:rPr>
+                  <w:rStyle w:val="Hyperlink"/>
+                </w:rPr>
+                <w:t xml:space="preserve">Vector Calculus</w:t>
+              </w:r>
+            </w:hyperlink>
+          </w:p>
+        </w:tc>
+        <w:tc>
+          <w:tcPr/>
+          <w:p>
+            <w:pPr>
+              <w:pStyle w:val="Compact"/>
+            </w:pPr>
+            <w:r>
+              <w:rPr>
+                <w:rStyle w:val="VerbatimChar"/>
+              </w:rPr>
+              <w:t xml:space="preserve">mds/_subfiles/_sec_vector_calc.qmd</w:t>
+            </w:r>
+          </w:p>
+        </w:tc>
+      </w:tr>
+      <w:tr>
+        <w:tc>
+          <w:tcPr/>
+          <w:p>
+            <w:pPr>
+              <w:pStyle w:val="Compact"/>
+            </w:pPr>
+            <w:hyperlink r:id="rId14">
+              <w:r>
+                <w:rPr>
+                  <w:rStyle w:val="Hyperlink"/>
+                </w:rPr>
+                <w:t xml:space="preserve">Proof Writing</w:t>
+              </w:r>
+            </w:hyperlink>
+          </w:p>
+        </w:tc>
+        <w:tc>
+          <w:tcPr/>
+          <w:p>
+            <w:pPr>
+              <w:pStyle w:val="Compact"/>
+            </w:pPr>
+            <w:r>
+              <w:rPr>
+                <w:rStyle w:val="VerbatimChar"/>
+              </w:rPr>
+              <w:t xml:space="preserve">mds/_proof-writing.qmd</w:t>
+            </w:r>
+          </w:p>
+        </w:tc>
+      </w:tr>
+    </w:tbl>
+    <w:p>
+      <w:pPr>
+        <w:pStyle w:val="BodyText"/>
+      </w:pPr>
+      <w:r>
+        <w:rPr>
+          <w:rStyle w:val="VerbatimChar"/>
+        </w:rPr>
+        <w:t xml:space="preserve">_notation.qmd</w:t>
+      </w:r>
+      <w:r>
+        <w:t xml:space="preserve"> </w:t>
+      </w:r>
+      <w:r>
+        <w:t xml:space="preserve">and</w:t>
+      </w:r>
+      <w:r>
+        <w:t xml:space="preserve"> </w:t>
+      </w:r>
+      <w:r>
+        <w:rPr>
+          <w:rStyle w:val="VerbatimChar"/>
+        </w:rPr>
+        <w:t xml:space="preserve">_algebra.qmd</w:t>
+      </w:r>
+      <w:r>
+        <w:t xml:space="preserve"> </w:t>
+      </w:r>
+      <w:r>
+        <w:t xml:space="preserve">include</w:t>
+      </w:r>
+      <w:r>
+        <w:t xml:space="preserve"> </w:t>
+      </w:r>
+      <w:r>
+        <w:rPr>
+          <w:rStyle w:val="VerbatimChar"/>
+        </w:rPr>
+        <w:t xml:space="preserve">latex-macros/macros.qmd</w:t>
+      </w:r>
+      <w:r>
+        <w:t xml:space="preserve"> </w:t>
+      </w:r>
+      <w:r>
+        <w:t xml:space="preserve">themselves;</w:t>
+      </w:r>
+      <w:r>
+        <w:t xml:space="preserve"> </w:t>
+      </w:r>
+      <w:r>
+        <w:t xml:space="preserve">a host page that includes any of the other fragments</w:t>
+      </w:r>
+      <w:r>
+        <w:t xml:space="preserve"> </w:t>
+      </w:r>
+      <w:r>
+        <w:t xml:space="preserve">must include</w:t>
+      </w:r>
+      <w:r>
+        <w:t xml:space="preserve"> </w:t>
+      </w:r>
+      <w:r>
+        <w:rPr>
+          <w:rStyle w:val="VerbatimChar"/>
+        </w:rPr>
+        <w:t xml:space="preserve">latex-macros/macros.qmd</w:t>
+      </w:r>
+      <w:r>
+        <w:t xml:space="preserve"> </w:t>
+      </w:r>
+      <w:r>
+        <w:t xml:space="preserve">first,</w:t>
+      </w:r>
+      <w:r>
+        <w:t xml:space="preserve"> </w:t>
+      </w:r>
+      <w:r>
+        <w:t xml:space="preserve">as the pages of this site do.</w:t>
+      </w:r>
+    </w:p>
+    <w:p>
+      <w:pPr>
+        <w:pStyle w:val="BodyText"/>
+      </w:pPr>
+      <w:r>
         <w:t xml:space="preserve">Quarto resolves</w:t>
       </w:r>
       <w:r>
@@ -194,14 +765,80 @@
         <w:rPr>
           <w:rStyle w:val="VerbatimChar"/>
         </w:rPr>
-        <w:t xml:space="preserve">[text](math-prereqs.qmd#id)</w:t>
+        <w:t xml:space="preserve">[text](notation.qmd#id)</w:t>
       </w:r>
       <w:r>
         <w:t xml:space="preserve">.</w:t>
       </w:r>
     </w:p>
-    <w:bookmarkEnd w:id="10"/>
-    <w:bookmarkEnd w:id="11"/>
+    <w:bookmarkEnd w:id="16"/>
+    <w:bookmarkStart w:id="20" w:name="references"/>
+    <w:p>
+      <w:pPr>
+        <w:pStyle w:val="Heading2"/>
+      </w:pPr>
+      <w:r>
+        <w:t xml:space="preserve">References</w:t>
+      </w:r>
+    </w:p>
+    <w:bookmarkStart w:id="19" w:name="refs"/>
+    <w:bookmarkStart w:id="18" w:name="ref-cheng2025math"/>
+    <w:p>
+      <w:pPr>
+        <w:pStyle w:val="Bibliography"/>
+      </w:pPr>
+      <w:r>
+        <w:t xml:space="preserve">Cheng, Eugenia. 2025.</w:t>
+      </w:r>
+      <w:r>
+        <w:t xml:space="preserve"> </w:t>
+      </w:r>
+      <w:r>
+        <w:t xml:space="preserve">“Opinion | How Math Turned Me from a</w:t>
+      </w:r>
+      <w:r>
+        <w:t xml:space="preserve"> </w:t>
+      </w:r>
+      <w:r>
+        <w:t xml:space="preserve">D.E.I.</w:t>
+      </w:r>
+      <w:r>
+        <w:t xml:space="preserve"> </w:t>
+      </w:r>
+      <w:r>
+        <w:t xml:space="preserve">Skeptic to a Supporter.”</w:t>
+      </w:r>
+      <w:r>
+        <w:t xml:space="preserve"> </w:t>
+      </w:r>
+      <w:r>
+        <w:rPr>
+          <w:i/>
+          <w:iCs/>
+        </w:rPr>
+        <w:t xml:space="preserve">The New York Times</w:t>
+      </w:r>
+      <w:r>
+        <w:t xml:space="preserve">.</w:t>
+      </w:r>
+      <w:r>
+        <w:t xml:space="preserve"> </w:t>
+      </w:r>
+      <w:hyperlink r:id="rId17">
+        <w:r>
+          <w:rPr>
+            <w:rStyle w:val="Hyperlink"/>
+          </w:rPr>
+          <w:t xml:space="preserve">https://www.nytimes.com/2025/09/05/opinion/math-dei.html</w:t>
+        </w:r>
+      </w:hyperlink>
+      <w:r>
+        <w:t xml:space="preserve">.</w:t>
+      </w:r>
+    </w:p>
+    <w:bookmarkEnd w:id="18"/>
+    <w:bookmarkEnd w:id="19"/>
+    <w:bookmarkEnd w:id="20"/>
     <w:sectPr>
       <w:footnotePr>
         <w:numRestart w:val="eachSect"/>

</xml_diff>

<commit_message>
Deploying to gh-pages from @ Morrison-Lab/mds@1aa87bac7930b138acf09763a6521914ee5ad855 🚀
</commit_message>
<xml_diff>
--- a/index.docx
+++ b/index.docx
@@ -15,10 +15,10 @@
         <w:pStyle w:val="Date"/>
       </w:pPr>
       <w:r>
-        <w:t xml:space="preserve">Last modified: 2026-09-28 15:10:58 (PDT)</w:t>
+        <w:t xml:space="preserve">Last modified: 2026-09-28 16:01:14 (PDT)</w:t>
       </w:r>
     </w:p>
-    <w:bookmarkStart w:id="15" w:name="welcome"/>
+    <w:bookmarkStart w:id="16" w:name="welcome"/>
     <w:p>
       <w:pPr>
         <w:pStyle w:val="Heading2"/>
@@ -144,7 +144,7 @@
           <w:rPr>
             <w:rStyle w:val="Hyperlink"/>
           </w:rPr>
-          <w:t xml:space="preserve">Algebra</w:t>
+          <w:t xml:space="preserve">Sets and Functions</w:t>
         </w:r>
       </w:hyperlink>
       <w:r>
@@ -154,13 +154,19 @@
         <w:t xml:space="preserve"> </w:t>
       </w:r>
       <w:r>
-        <w:t xml:space="preserve">equalities and inequalities, infimum and supremum,</w:t>
-      </w:r>
-      <w:r>
-        <w:t xml:space="preserve"> </w:t>
-      </w:r>
-      <w:r>
-        <w:t xml:space="preserve">sums, products, quotients, exponentials and logarithms</w:t>
+        <w:t xml:space="preserve">sets, subsets, the empty set, unions and intersections, countable sets,</w:t>
+      </w:r>
+      <w:r>
+        <w:t xml:space="preserve"> </w:t>
+      </w:r>
+      <w:r>
+        <w:t xml:space="preserve">functions with their domains, codomains, and images,</w:t>
+      </w:r>
+      <w:r>
+        <w:t xml:space="preserve"> </w:t>
+      </w:r>
+      <w:r>
+        <w:t xml:space="preserve">and the extended non-negative real numbers</w:t>
       </w:r>
     </w:p>
     <w:p>
@@ -172,6 +178,38 @@
         </w:numPr>
       </w:pPr>
       <w:hyperlink r:id="rId11">
+        <w:r>
+          <w:rPr>
+            <w:rStyle w:val="Hyperlink"/>
+          </w:rPr>
+          <w:t xml:space="preserve">Algebra</w:t>
+        </w:r>
+      </w:hyperlink>
+      <w:r>
+        <w:t xml:space="preserve">:</w:t>
+      </w:r>
+      <w:r>
+        <w:t xml:space="preserve"> </w:t>
+      </w:r>
+      <w:r>
+        <w:t xml:space="preserve">equalities and inequalities, infimum and supremum,</w:t>
+      </w:r>
+      <w:r>
+        <w:t xml:space="preserve"> </w:t>
+      </w:r>
+      <w:r>
+        <w:t xml:space="preserve">sums, products, quotients, exponentials and logarithms</w:t>
+      </w:r>
+    </w:p>
+    <w:p>
+      <w:pPr>
+        <w:pStyle w:val="Compact"/>
+        <w:numPr>
+          <w:ilvl w:val="0"/>
+          <w:numId w:val="1001"/>
+        </w:numPr>
+      </w:pPr>
+      <w:hyperlink r:id="rId12">
         <w:r>
           <w:rPr>
             <w:rStyle w:val="Hyperlink"/>
@@ -203,7 +241,7 @@
           <w:numId w:val="1001"/>
         </w:numPr>
       </w:pPr>
-      <w:hyperlink r:id="rId12">
+      <w:hyperlink r:id="rId13">
         <w:r>
           <w:rPr>
             <w:rStyle w:val="Hyperlink"/>
@@ -235,7 +273,7 @@
           <w:numId w:val="1001"/>
         </w:numPr>
       </w:pPr>
-      <w:hyperlink r:id="rId13">
+      <w:hyperlink r:id="rId14">
         <w:r>
           <w:rPr>
             <w:rStyle w:val="Hyperlink"/>
@@ -267,7 +305,7 @@
           <w:numId w:val="1001"/>
         </w:numPr>
       </w:pPr>
-      <w:hyperlink r:id="rId14">
+      <w:hyperlink r:id="rId15">
         <w:r>
           <w:rPr>
             <w:rStyle w:val="Hyperlink"/>
@@ -285,8 +323,8 @@
         <w:t xml:space="preserve">showing and annotating every step of a derivation</w:t>
       </w:r>
     </w:p>
-    <w:bookmarkEnd w:id="15"/>
-    <w:bookmarkStart w:id="16" w:name="using-these-notes-in-another-site"/>
+    <w:bookmarkEnd w:id="16"/>
+    <w:bookmarkStart w:id="17" w:name="using-these-notes-in-another-site"/>
     <w:p>
       <w:pPr>
         <w:pStyle w:val="Heading2"/>
@@ -471,6 +509,38 @@
                 <w:rPr>
                   <w:rStyle w:val="Hyperlink"/>
                 </w:rPr>
+                <w:t xml:space="preserve">Sets and Functions</w:t>
+              </w:r>
+            </w:hyperlink>
+          </w:p>
+        </w:tc>
+        <w:tc>
+          <w:tcPr/>
+          <w:p>
+            <w:pPr>
+              <w:pStyle w:val="Compact"/>
+            </w:pPr>
+            <w:r>
+              <w:rPr>
+                <w:rStyle w:val="VerbatimChar"/>
+              </w:rPr>
+              <w:t xml:space="preserve">mds/_sets-functions.qmd</w:t>
+            </w:r>
+          </w:p>
+        </w:tc>
+      </w:tr>
+      <w:tr>
+        <w:tc>
+          <w:tcPr/>
+          <w:p>
+            <w:pPr>
+              <w:pStyle w:val="Compact"/>
+            </w:pPr>
+            <w:hyperlink r:id="rId11">
+              <w:r>
+                <w:rPr>
+                  <w:rStyle w:val="Hyperlink"/>
+                </w:rPr>
                 <w:t xml:space="preserve">Algebra</w:t>
               </w:r>
             </w:hyperlink>
@@ -498,7 +568,7 @@
             <w:pPr>
               <w:pStyle w:val="Compact"/>
             </w:pPr>
-            <w:hyperlink r:id="rId11">
+            <w:hyperlink r:id="rId12">
               <w:r>
                 <w:rPr>
                   <w:rStyle w:val="Hyperlink"/>
@@ -554,7 +624,7 @@
             <w:pPr>
               <w:pStyle w:val="Compact"/>
             </w:pPr>
-            <w:hyperlink r:id="rId12">
+            <w:hyperlink r:id="rId13">
               <w:r>
                 <w:rPr>
                   <w:rStyle w:val="Hyperlink"/>
@@ -586,7 +656,7 @@
             <w:pPr>
               <w:pStyle w:val="Compact"/>
             </w:pPr>
-            <w:hyperlink r:id="rId13">
+            <w:hyperlink r:id="rId14">
               <w:r>
                 <w:rPr>
                   <w:rStyle w:val="Hyperlink"/>
@@ -618,7 +688,7 @@
             <w:pPr>
               <w:pStyle w:val="Compact"/>
             </w:pPr>
-            <w:hyperlink r:id="rId14">
+            <w:hyperlink r:id="rId15">
               <w:r>
                 <w:rPr>
                   <w:rStyle w:val="Hyperlink"/>
@@ -655,10 +725,19 @@
         <w:t xml:space="preserve">_notation.qmd</w:t>
       </w:r>
       <w:r>
-        <w:t xml:space="preserve"> </w:t>
-      </w:r>
-      <w:r>
-        <w:t xml:space="preserve">and</w:t>
+        <w:t xml:space="preserve">,</w:t>
+      </w:r>
+      <w:r>
+        <w:t xml:space="preserve"> </w:t>
+      </w:r>
+      <w:r>
+        <w:rPr>
+          <w:rStyle w:val="VerbatimChar"/>
+        </w:rPr>
+        <w:t xml:space="preserve">_sets-functions.qmd</w:t>
+      </w:r>
+      <w:r>
+        <w:t xml:space="preserve">, and</w:t>
       </w:r>
       <w:r>
         <w:t xml:space="preserve"> </w:t>
@@ -771,8 +850,8 @@
         <w:t xml:space="preserve">.</w:t>
       </w:r>
     </w:p>
-    <w:bookmarkEnd w:id="16"/>
-    <w:bookmarkStart w:id="20" w:name="references"/>
+    <w:bookmarkEnd w:id="17"/>
+    <w:bookmarkStart w:id="21" w:name="references"/>
     <w:p>
       <w:pPr>
         <w:pStyle w:val="Heading2"/>
@@ -781,8 +860,8 @@
         <w:t xml:space="preserve">References</w:t>
       </w:r>
     </w:p>
-    <w:bookmarkStart w:id="19" w:name="refs"/>
-    <w:bookmarkStart w:id="18" w:name="ref-cheng2025math"/>
+    <w:bookmarkStart w:id="20" w:name="refs"/>
+    <w:bookmarkStart w:id="19" w:name="ref-cheng2025math"/>
     <w:p>
       <w:pPr>
         <w:pStyle w:val="Bibliography"/>
@@ -824,7 +903,7 @@
       <w:r>
         <w:t xml:space="preserve"> </w:t>
       </w:r>
-      <w:hyperlink r:id="rId17">
+      <w:hyperlink r:id="rId18">
         <w:r>
           <w:rPr>
             <w:rStyle w:val="Hyperlink"/>
@@ -836,9 +915,9 @@
         <w:t xml:space="preserve">.</w:t>
       </w:r>
     </w:p>
-    <w:bookmarkEnd w:id="18"/>
     <w:bookmarkEnd w:id="19"/>
     <w:bookmarkEnd w:id="20"/>
+    <w:bookmarkEnd w:id="21"/>
     <w:sectPr>
       <w:footnotePr>
         <w:numRestart w:val="eachSect"/>

</xml_diff>

<commit_message>
Deploying to gh-pages from @ Morrison-Lab/mds@d41beeb6b4b5ef7283e500dd5b117ed433cbe6d3 🚀
</commit_message>
<xml_diff>
--- a/index.docx
+++ b/index.docx
@@ -15,10 +15,10 @@
         <w:pStyle w:val="Date"/>
       </w:pPr>
       <w:r>
-        <w:t xml:space="preserve">Last modified: 2026-09-28 16:01:14 (PDT)</w:t>
+        <w:t xml:space="preserve">Last modified: 2026-09-28 16:23:58 (PDT)</w:t>
       </w:r>
     </w:p>
-    <w:bookmarkStart w:id="16" w:name="welcome"/>
+    <w:bookmarkStart w:id="17" w:name="welcome"/>
     <w:p>
       <w:pPr>
         <w:pStyle w:val="Heading2"/>
@@ -214,7 +214,7 @@
           <w:rPr>
             <w:rStyle w:val="Hyperlink"/>
           </w:rPr>
-          <w:t xml:space="preserve">Calculus</w:t>
+          <w:t xml:space="preserve">Measures</w:t>
         </w:r>
       </w:hyperlink>
       <w:r>
@@ -223,14 +223,19 @@
       <w:r>
         <w:t xml:space="preserve"> </w:t>
       </w:r>
-      <w:r>
-        <w:t xml:space="preserve">derivative rules, antiderivatives, regularity conditions,</w:t>
-      </w:r>
-      <w:r>
-        <w:t xml:space="preserve"> </w:t>
-      </w:r>
-      <w:r>
-        <w:t xml:space="preserve">the Fundamental Theorem of Calculus, and double integrals</w:t>
+      <m:oMath>
+        <m:r>
+          <m:t>σ</m:t>
+        </m:r>
+      </m:oMath>
+      <w:r>
+        <w:t xml:space="preserve">-algebras, pairwise disjoint sets, finite and countable additivity,</w:t>
+      </w:r>
+      <w:r>
+        <w:t xml:space="preserve"> </w:t>
+      </w:r>
+      <w:r>
+        <w:t xml:space="preserve">measures, and the counting measure</w:t>
       </w:r>
     </w:p>
     <w:p>
@@ -242,6 +247,38 @@
         </w:numPr>
       </w:pPr>
       <w:hyperlink r:id="rId13">
+        <w:r>
+          <w:rPr>
+            <w:rStyle w:val="Hyperlink"/>
+          </w:rPr>
+          <w:t xml:space="preserve">Calculus</w:t>
+        </w:r>
+      </w:hyperlink>
+      <w:r>
+        <w:t xml:space="preserve">:</w:t>
+      </w:r>
+      <w:r>
+        <w:t xml:space="preserve"> </w:t>
+      </w:r>
+      <w:r>
+        <w:t xml:space="preserve">derivative rules, antiderivatives, regularity conditions,</w:t>
+      </w:r>
+      <w:r>
+        <w:t xml:space="preserve"> </w:t>
+      </w:r>
+      <w:r>
+        <w:t xml:space="preserve">the Fundamental Theorem of Calculus, and double integrals</w:t>
+      </w:r>
+    </w:p>
+    <w:p>
+      <w:pPr>
+        <w:pStyle w:val="Compact"/>
+        <w:numPr>
+          <w:ilvl w:val="0"/>
+          <w:numId w:val="1001"/>
+        </w:numPr>
+      </w:pPr>
+      <w:hyperlink r:id="rId14">
         <w:r>
           <w:rPr>
             <w:rStyle w:val="Hyperlink"/>
@@ -273,7 +310,7 @@
           <w:numId w:val="1001"/>
         </w:numPr>
       </w:pPr>
-      <w:hyperlink r:id="rId14">
+      <w:hyperlink r:id="rId15">
         <w:r>
           <w:rPr>
             <w:rStyle w:val="Hyperlink"/>
@@ -305,7 +342,7 @@
           <w:numId w:val="1001"/>
         </w:numPr>
       </w:pPr>
-      <w:hyperlink r:id="rId15">
+      <w:hyperlink r:id="rId16">
         <w:r>
           <w:rPr>
             <w:rStyle w:val="Hyperlink"/>
@@ -323,8 +360,8 @@
         <w:t xml:space="preserve">showing and annotating every step of a derivation</w:t>
       </w:r>
     </w:p>
-    <w:bookmarkEnd w:id="16"/>
-    <w:bookmarkStart w:id="17" w:name="using-these-notes-in-another-site"/>
+    <w:bookmarkEnd w:id="17"/>
+    <w:bookmarkStart w:id="18" w:name="using-these-notes-in-another-site"/>
     <w:p>
       <w:pPr>
         <w:pStyle w:val="Heading2"/>
@@ -573,6 +610,38 @@
                 <w:rPr>
                   <w:rStyle w:val="Hyperlink"/>
                 </w:rPr>
+                <w:t xml:space="preserve">Measures</w:t>
+              </w:r>
+            </w:hyperlink>
+          </w:p>
+        </w:tc>
+        <w:tc>
+          <w:tcPr/>
+          <w:p>
+            <w:pPr>
+              <w:pStyle w:val="Compact"/>
+            </w:pPr>
+            <w:r>
+              <w:rPr>
+                <w:rStyle w:val="VerbatimChar"/>
+              </w:rPr>
+              <w:t xml:space="preserve">mds/_measures.qmd</w:t>
+            </w:r>
+          </w:p>
+        </w:tc>
+      </w:tr>
+      <w:tr>
+        <w:tc>
+          <w:tcPr/>
+          <w:p>
+            <w:pPr>
+              <w:pStyle w:val="Compact"/>
+            </w:pPr>
+            <w:hyperlink r:id="rId13">
+              <w:r>
+                <w:rPr>
+                  <w:rStyle w:val="Hyperlink"/>
+                </w:rPr>
                 <w:t xml:space="preserve">Calculus</w:t>
               </w:r>
             </w:hyperlink>
@@ -624,7 +693,7 @@
             <w:pPr>
               <w:pStyle w:val="Compact"/>
             </w:pPr>
-            <w:hyperlink r:id="rId13">
+            <w:hyperlink r:id="rId14">
               <w:r>
                 <w:rPr>
                   <w:rStyle w:val="Hyperlink"/>
@@ -656,7 +725,7 @@
             <w:pPr>
               <w:pStyle w:val="Compact"/>
             </w:pPr>
-            <w:hyperlink r:id="rId14">
+            <w:hyperlink r:id="rId15">
               <w:r>
                 <w:rPr>
                   <w:rStyle w:val="Hyperlink"/>
@@ -688,7 +757,7 @@
             <w:pPr>
               <w:pStyle w:val="Compact"/>
             </w:pPr>
-            <w:hyperlink r:id="rId15">
+            <w:hyperlink r:id="rId16">
               <w:r>
                 <w:rPr>
                   <w:rStyle w:val="Hyperlink"/>
@@ -737,7 +806,7 @@
         <w:t xml:space="preserve">_sets-functions.qmd</w:t>
       </w:r>
       <w:r>
-        <w:t xml:space="preserve">, and</w:t>
+        <w:t xml:space="preserve">,</w:t>
       </w:r>
       <w:r>
         <w:t xml:space="preserve"> </w:t>
@@ -749,6 +818,18 @@
         <w:t xml:space="preserve">_algebra.qmd</w:t>
       </w:r>
       <w:r>
+        <w:t xml:space="preserve">, and</w:t>
+      </w:r>
+      <w:r>
+        <w:t xml:space="preserve"> </w:t>
+      </w:r>
+      <w:r>
+        <w:rPr>
+          <w:rStyle w:val="VerbatimChar"/>
+        </w:rPr>
+        <w:t xml:space="preserve">_measures.qmd</w:t>
+      </w:r>
+      <w:r>
         <w:t xml:space="preserve"> </w:t>
       </w:r>
       <w:r>
@@ -850,8 +931,8 @@
         <w:t xml:space="preserve">.</w:t>
       </w:r>
     </w:p>
-    <w:bookmarkEnd w:id="17"/>
-    <w:bookmarkStart w:id="21" w:name="references"/>
+    <w:bookmarkEnd w:id="18"/>
+    <w:bookmarkStart w:id="22" w:name="references"/>
     <w:p>
       <w:pPr>
         <w:pStyle w:val="Heading2"/>
@@ -860,8 +941,8 @@
         <w:t xml:space="preserve">References</w:t>
       </w:r>
     </w:p>
-    <w:bookmarkStart w:id="20" w:name="refs"/>
-    <w:bookmarkStart w:id="19" w:name="ref-cheng2025math"/>
+    <w:bookmarkStart w:id="21" w:name="refs"/>
+    <w:bookmarkStart w:id="20" w:name="ref-cheng2025math"/>
     <w:p>
       <w:pPr>
         <w:pStyle w:val="Bibliography"/>
@@ -903,7 +984,7 @@
       <w:r>
         <w:t xml:space="preserve"> </w:t>
       </w:r>
-      <w:hyperlink r:id="rId18">
+      <w:hyperlink r:id="rId19">
         <w:r>
           <w:rPr>
             <w:rStyle w:val="Hyperlink"/>
@@ -915,9 +996,9 @@
         <w:t xml:space="preserve">.</w:t>
       </w:r>
     </w:p>
-    <w:bookmarkEnd w:id="19"/>
     <w:bookmarkEnd w:id="20"/>
     <w:bookmarkEnd w:id="21"/>
+    <w:bookmarkEnd w:id="22"/>
     <w:sectPr>
       <w:footnotePr>
         <w:numRestart w:val="eachSect"/>

</xml_diff>

<commit_message>
Deploying to gh-pages from @ Morrison-Lab/mds@72e07d8ffd17b3f3e6c2200ca6676be1aa8d434b 🚀
</commit_message>
<xml_diff>
--- a/index.docx
+++ b/index.docx
@@ -15,7 +15,7 @@
         <w:pStyle w:val="Date"/>
       </w:pPr>
       <w:r>
-        <w:t xml:space="preserve">Last modified: 2026-09-28 16:23:58 (PDT)</w:t>
+        <w:t xml:space="preserve">Last modified: 2026-09-28 16:24:06 (PDT)</w:t>
       </w:r>
     </w:p>
     <w:bookmarkStart w:id="17" w:name="welcome"/>
@@ -154,7 +154,13 @@
         <w:t xml:space="preserve"> </w:t>
       </w:r>
       <w:r>
-        <w:t xml:space="preserve">sets, subsets, the empty set, unions and intersections, countable sets,</w:t>
+        <w:t xml:space="preserve">sets, subsets and supersets, the empty set,</w:t>
+      </w:r>
+      <w:r>
+        <w:t xml:space="preserve"> </w:t>
+      </w:r>
+      <w:r>
+        <w:t xml:space="preserve">unions, intersections, and set differences, countable sets,</w:t>
       </w:r>
       <w:r>
         <w:t xml:space="preserve"> </w:t>

</xml_diff>

<commit_message>
Deploying to gh-pages from @ Morrison-Lab/mds@aa7e75cb069eb25385d8645675b98e4f4bcde6d4 🚀
</commit_message>
<xml_diff>
--- a/index.docx
+++ b/index.docx
@@ -15,7 +15,7 @@
         <w:pStyle w:val="Date"/>
       </w:pPr>
       <w:r>
-        <w:t xml:space="preserve">Last modified: 2026-09-28 20:17:14 (PDT)</w:t>
+        <w:t xml:space="preserve">Last modified: 2026-09-28 22:02:47 (PDT)</w:t>
       </w:r>
     </w:p>
     <w:bookmarkStart w:id="17" w:name="welcome"/>
@@ -305,7 +305,13 @@
         <w:t xml:space="preserve"> </w:t>
       </w:r>
       <w:r>
-        <w:t xml:space="preserve">quadratic forms, and the design matrix</w:t>
+        <w:t xml:space="preserve">quadratic forms, eigendecompositions, definite matrices,</w:t>
+      </w:r>
+      <w:r>
+        <w:t xml:space="preserve"> </w:t>
+      </w:r>
+      <w:r>
+        <w:t xml:space="preserve">determinants, and the design matrix</w:t>
       </w:r>
     </w:p>
     <w:p>

</xml_diff>

<commit_message>
Deploying to gh-pages from @ Morrison-Lab/mds@b5252626394ebfdc44721e916403175097a6064e 🚀
</commit_message>
<xml_diff>
--- a/index.docx
+++ b/index.docx
@@ -15,7 +15,7 @@
         <w:pStyle w:val="Date"/>
       </w:pPr>
       <w:r>
-        <w:t xml:space="preserve">Last modified: 2026-10-02 16:44:20 (PDT)</w:t>
+        <w:t xml:space="preserve">Last modified: 2026-10-03 01:05:12 (PDT)</w:t>
       </w:r>
     </w:p>
     <w:bookmarkStart w:id="17" w:name="welcome"/>
@@ -387,7 +387,19 @@
         <w:pStyle w:val="FirstParagraph"/>
       </w:pPr>
       <w:r>
-        <w:t xml:space="preserve">Course sites include these notes as a git submodule named</w:t>
+        <w:t xml:space="preserve">Course sites link to these pages by URL;</w:t>
+      </w:r>
+      <w:r>
+        <w:t xml:space="preserve"> </w:t>
+      </w:r>
+      <w:r>
+        <w:t xml:space="preserve">they do not include this repository as a git submodule.</w:t>
+      </w:r>
+      <w:r>
+        <w:t xml:space="preserve"> </w:t>
+      </w:r>
+      <w:r>
+        <w:t xml:space="preserve">A host site that keeps a copy of this repository at its root, named</w:t>
       </w:r>
       <w:r>
         <w:t xml:space="preserve"> </w:t>
@@ -399,16 +411,13 @@
         <w:t xml:space="preserve">mds</w:t>
       </w:r>
       <w:r>
-        <w:t xml:space="preserve"> </w:t>
-      </w:r>
-      <w:r>
-        <w:t xml:space="preserve">at the site’s root,</w:t>
-      </w:r>
-      <w:r>
-        <w:t xml:space="preserve"> </w:t>
-      </w:r>
-      <w:r>
-        <w:t xml:space="preserve">and include fragments with paths that start with</w:t>
+        <w:t xml:space="preserve">,</w:t>
+      </w:r>
+      <w:r>
+        <w:t xml:space="preserve"> </w:t>
+      </w:r>
+      <w:r>
+        <w:t xml:space="preserve">can still include fragments with paths that start with</w:t>
       </w:r>
       <w:r>
         <w:t xml:space="preserve"> </w:t>

</xml_diff>

<commit_message>
Deploying to gh-pages from @ Morrison-Lab/mds@3e1a5292cb1793ff4553fcbfe4341af94a60213c 🚀
</commit_message>
<xml_diff>
--- a/index.docx
+++ b/index.docx
@@ -15,7 +15,7 @@
         <w:pStyle w:val="Date"/>
       </w:pPr>
       <w:r>
-        <w:t xml:space="preserve">Last modified: 2026-10-03 01:36:11 (PDT)</w:t>
+        <w:t xml:space="preserve">Last modified: 2026-10-03 01:44:37 (PDT)</w:t>
       </w:r>
     </w:p>
     <w:bookmarkStart w:id="17" w:name="welcome"/>
@@ -373,7 +373,226 @@
       </w:r>
     </w:p>
     <w:bookmarkEnd w:id="17"/>
-    <w:bookmarkStart w:id="18" w:name="using-these-notes-in-another-site"/>
+    <w:bookmarkStart w:id="22" w:name="further-reading"/>
+    <w:p>
+      <w:pPr>
+        <w:pStyle w:val="Heading2"/>
+      </w:pPr>
+      <w:r>
+        <w:t xml:space="preserve">Further reading</w:t>
+      </w:r>
+    </w:p>
+    <w:p>
+      <w:pPr>
+        <w:pStyle w:val="FirstParagraph"/>
+      </w:pPr>
+      <w:r>
+        <w:t xml:space="preserve">These resources cover related material.</w:t>
+      </w:r>
+    </w:p>
+    <w:p>
+      <w:pPr>
+        <w:pStyle w:val="Compact"/>
+        <w:numPr>
+          <w:ilvl w:val="0"/>
+          <w:numId w:val="1002"/>
+        </w:numPr>
+      </w:pPr>
+      <w:hyperlink r:id="rId18">
+        <w:r>
+          <w:rPr>
+            <w:rStyle w:val="Hyperlink"/>
+          </w:rPr>
+          <w:t xml:space="preserve">Mathematical Methods in Data Science (MMiDS)</w:t>
+        </w:r>
+      </w:hyperlink>
+      <w:r>
+        <w:t xml:space="preserve"> </w:t>
+      </w:r>
+      <w:r>
+        <w:t xml:space="preserve">by Sebastien Roch (University of Wisconsin-Madison),</w:t>
+      </w:r>
+      <w:r>
+        <w:t xml:space="preserve"> </w:t>
+      </w:r>
+      <w:r>
+        <w:t xml:space="preserve">is available online and in print from Cambridge University Press.</w:t>
+      </w:r>
+      <w:r>
+        <w:t xml:space="preserve"> </w:t>
+      </w:r>
+      <w:r>
+        <w:t xml:space="preserve">It grew out of MATH 535, a one-semester advanced undergraduate and master’s course at the University of Wisconsin-Madison.</w:t>
+      </w:r>
+      <w:r>
+        <w:t xml:space="preserve"> </w:t>
+      </w:r>
+      <w:r>
+        <w:t xml:space="preserve">It is written as an invitation to data science and AI for math students,</w:t>
+      </w:r>
+      <w:r>
+        <w:t xml:space="preserve"> </w:t>
+      </w:r>
+      <w:r>
+        <w:t xml:space="preserve">and as a mathematical companion to machine learning, AI, and statistics courses.</w:t>
+      </w:r>
+      <w:r>
+        <w:t xml:space="preserve"> </w:t>
+      </w:r>
+      <w:r>
+        <w:t xml:space="preserve">Its chapters treat least squares, optimization,</w:t>
+      </w:r>
+      <w:r>
+        <w:t xml:space="preserve"> </w:t>
+      </w:r>
+      <w:r>
+        <w:t xml:space="preserve">the singular value decomposition, spectral graph theory,</w:t>
+      </w:r>
+      <w:r>
+        <w:t xml:space="preserve"> </w:t>
+      </w:r>
+      <w:r>
+        <w:t xml:space="preserve">probabilistic models, random walks on graphs, and neural networks,</w:t>
+      </w:r>
+      <w:r>
+        <w:t xml:space="preserve"> </w:t>
+      </w:r>
+      <w:r>
+        <w:t xml:space="preserve">so they overlap with our linear algebra and vector calculus pages.</w:t>
+      </w:r>
+    </w:p>
+    <w:p>
+      <w:pPr>
+        <w:pStyle w:val="Compact"/>
+        <w:numPr>
+          <w:ilvl w:val="0"/>
+          <w:numId w:val="1002"/>
+        </w:numPr>
+      </w:pPr>
+      <w:hyperlink r:id="rId19">
+        <w:r>
+          <w:rPr>
+            <w:rStyle w:val="Hyperlink"/>
+          </w:rPr>
+          <w:t xml:space="preserve">UCLA Biostat 216, Mathematical Methods for Biostatistics</w:t>
+        </w:r>
+      </w:hyperlink>
+      <w:r>
+        <w:t xml:space="preserve"> </w:t>
+      </w:r>
+      <w:r>
+        <w:t xml:space="preserve">is a course for first-year biostatistics MS and PhD students at UCLA.</w:t>
+      </w:r>
+      <w:r>
+        <w:t xml:space="preserve"> </w:t>
+      </w:r>
+      <w:r>
+        <w:t xml:space="preserve">As of October 2026, the most recent course site in the organization</w:t>
+      </w:r>
+      <w:r>
+        <w:t xml:space="preserve"> </w:t>
+      </w:r>
+      <w:r>
+        <w:t xml:space="preserve">is the</w:t>
+      </w:r>
+      <w:r>
+        <w:t xml:space="preserve"> </w:t>
+      </w:r>
+      <w:hyperlink r:id="rId20">
+        <w:r>
+          <w:rPr>
+            <w:rStyle w:val="Hyperlink"/>
+          </w:rPr>
+          <w:t xml:space="preserve">2024 Fall edition</w:t>
+        </w:r>
+      </w:hyperlink>
+      <w:r>
+        <w:t xml:space="preserve">,</w:t>
+      </w:r>
+      <w:r>
+        <w:t xml:space="preserve"> </w:t>
+      </w:r>
+      <w:r>
+        <w:t xml:space="preserve">taught by Hua Zhou.</w:t>
+      </w:r>
+      <w:r>
+        <w:t xml:space="preserve"> </w:t>
+      </w:r>
+      <w:r>
+        <w:t xml:space="preserve">Its</w:t>
+      </w:r>
+      <w:r>
+        <w:t xml:space="preserve"> </w:t>
+      </w:r>
+      <w:hyperlink r:id="rId21">
+        <w:r>
+          <w:rPr>
+            <w:rStyle w:val="Hyperlink"/>
+          </w:rPr>
+          <w:t xml:space="preserve">schedule</w:t>
+        </w:r>
+      </w:hyperlink>
+      <w:r>
+        <w:t xml:space="preserve"> </w:t>
+      </w:r>
+      <w:r>
+        <w:t xml:space="preserve">links slides on vectors, matrices, vector spaces, rank, orthogonal projection,</w:t>
+      </w:r>
+      <w:r>
+        <w:t xml:space="preserve"> </w:t>
+      </w:r>
+      <w:r>
+        <w:t xml:space="preserve">matrix inverses, least squares, determinants, eigendecompositions,</w:t>
+      </w:r>
+      <w:r>
+        <w:t xml:space="preserve"> </w:t>
+      </w:r>
+      <w:r>
+        <w:t xml:space="preserve">positive (semi)definite matrices, the SVD, and multivariate calculus and optimization.</w:t>
+      </w:r>
+      <w:r>
+        <w:t xml:space="preserve"> </w:t>
+      </w:r>
+      <w:r>
+        <w:t xml:space="preserve">Those topics overlap with our</w:t>
+      </w:r>
+      <w:r>
+        <w:t xml:space="preserve"> </w:t>
+      </w:r>
+      <w:hyperlink r:id="rId14">
+        <w:r>
+          <w:rPr>
+            <w:rStyle w:val="Hyperlink"/>
+          </w:rPr>
+          <w:t xml:space="preserve">linear algebra</w:t>
+        </w:r>
+      </w:hyperlink>
+      <w:r>
+        <w:t xml:space="preserve"> </w:t>
+      </w:r>
+      <w:r>
+        <w:t xml:space="preserve">and</w:t>
+      </w:r>
+      <w:r>
+        <w:t xml:space="preserve"> </w:t>
+      </w:r>
+      <w:hyperlink r:id="rId15">
+        <w:r>
+          <w:rPr>
+            <w:rStyle w:val="Hyperlink"/>
+          </w:rPr>
+          <w:t xml:space="preserve">vector calculus</w:t>
+        </w:r>
+      </w:hyperlink>
+      <w:r>
+        <w:t xml:space="preserve"> </w:t>
+      </w:r>
+      <w:r>
+        <w:t xml:space="preserve">pages.</w:t>
+      </w:r>
+    </w:p>
+    <w:bookmarkEnd w:id="22"/>
+    <w:bookmarkStart w:id="23" w:name="using-these-notes-in-another-site"/>
     <w:p>
       <w:pPr>
         <w:pStyle w:val="Heading2"/>
@@ -964,8 +1183,8 @@
         <w:t xml:space="preserve">.</w:t>
       </w:r>
     </w:p>
-    <w:bookmarkEnd w:id="18"/>
-    <w:bookmarkStart w:id="22" w:name="references"/>
+    <w:bookmarkEnd w:id="23"/>
+    <w:bookmarkStart w:id="27" w:name="references"/>
     <w:p>
       <w:pPr>
         <w:pStyle w:val="Heading2"/>
@@ -974,8 +1193,8 @@
         <w:t xml:space="preserve">References</w:t>
       </w:r>
     </w:p>
-    <w:bookmarkStart w:id="21" w:name="refs"/>
-    <w:bookmarkStart w:id="20" w:name="ref-cheng2025math"/>
+    <w:bookmarkStart w:id="26" w:name="refs"/>
+    <w:bookmarkStart w:id="25" w:name="ref-cheng2025math"/>
     <w:p>
       <w:pPr>
         <w:pStyle w:val="Bibliography"/>
@@ -1017,7 +1236,7 @@
       <w:r>
         <w:t xml:space="preserve"> </w:t>
       </w:r>
-      <w:hyperlink r:id="rId19">
+      <w:hyperlink r:id="rId24">
         <w:r>
           <w:rPr>
             <w:rStyle w:val="Hyperlink"/>
@@ -1029,9 +1248,9 @@
         <w:t xml:space="preserve">.</w:t>
       </w:r>
     </w:p>
-    <w:bookmarkEnd w:id="20"/>
-    <w:bookmarkEnd w:id="21"/>
-    <w:bookmarkEnd w:id="22"/>
+    <w:bookmarkEnd w:id="25"/>
+    <w:bookmarkEnd w:id="26"/>
+    <w:bookmarkEnd w:id="27"/>
     <w:sectPr>
       <w:footnotePr>
         <w:numRestart w:val="eachSect"/>
@@ -1249,6 +1468,9 @@
     <w:abstractNumId w:val="990"/>
   </w:num>
   <w:num w:numId="1001">
+    <w:abstractNumId w:val="991"/>
+  </w:num>
+  <w:num w:numId="1002">
     <w:abstractNumId w:val="991"/>
   </w:num>
 </w:numbering>

</xml_diff>

<commit_message>
Deploying to gh-pages from @ Morrison-Lab/mds@2b04a86a81c40e16180e8b84648f76bdf94b03f2 🚀
</commit_message>
<xml_diff>
--- a/index.docx
+++ b/index.docx
@@ -15,10 +15,10 @@
         <w:pStyle w:val="Date"/>
       </w:pPr>
       <w:r>
-        <w:t xml:space="preserve">Last modified: 2026-10-05 21:21:41 (PDT)</w:t>
+        <w:t xml:space="preserve">Last modified: 2026-10-05 21:31:10 (PDT)</w:t>
       </w:r>
     </w:p>
-    <w:bookmarkStart w:id="17" w:name="welcome"/>
+    <w:bookmarkStart w:id="22" w:name="welcome"/>
     <w:p>
       <w:pPr>
         <w:pStyle w:val="Heading2"/>
@@ -198,7 +198,21 @@
         <w:t xml:space="preserve"> </w:t>
       </w:r>
       <w:r>
-        <w:t xml:space="preserve">equalities and inequalities, infimum and supremum,</w:t>
+        <w:t xml:space="preserve">equalities and</w:t>
+      </w:r>
+      <w:r>
+        <w:t xml:space="preserve"> </w:t>
+      </w:r>
+      <w:hyperlink r:id="rId12">
+        <w:r>
+          <w:rPr>
+            <w:rStyle w:val="Hyperlink"/>
+          </w:rPr>
+          <w:t xml:space="preserve">inequalities</w:t>
+        </w:r>
+      </w:hyperlink>
+      <w:r>
+        <w:t xml:space="preserve">, infimum and supremum,</w:t>
       </w:r>
       <w:r>
         <w:t xml:space="preserve"> </w:t>
@@ -215,7 +229,7 @@
           <w:numId w:val="1001"/>
         </w:numPr>
       </w:pPr>
-      <w:hyperlink r:id="rId12">
+      <w:hyperlink r:id="rId13">
         <w:r>
           <w:rPr>
             <w:rStyle w:val="Hyperlink"/>
@@ -252,7 +266,7 @@
           <w:numId w:val="1001"/>
         </w:numPr>
       </w:pPr>
-      <w:hyperlink r:id="rId13">
+      <w:hyperlink r:id="rId14">
         <w:r>
           <w:rPr>
             <w:rStyle w:val="Hyperlink"/>
@@ -267,7 +281,64 @@
         <w:t xml:space="preserve"> </w:t>
       </w:r>
       <w:r>
-        <w:t xml:space="preserve">derivative rules, antiderivatives, regularity conditions,</w:t>
+        <w:t xml:space="preserve">derivative rules, antiderivatives,</w:t>
+      </w:r>
+      <w:r>
+        <w:t xml:space="preserve"> </w:t>
+      </w:r>
+      <w:r>
+        <w:t xml:space="preserve">regularity conditions (the</w:t>
+      </w:r>
+      <w:r>
+        <w:t xml:space="preserve"> </w:t>
+      </w:r>
+      <w:hyperlink r:id="rId15">
+        <w:r>
+          <w:rPr>
+            <w:rStyle w:val="Hyperlink"/>
+          </w:rPr>
+          <w:t xml:space="preserve">continuity</w:t>
+        </w:r>
+      </w:hyperlink>
+      <w:r>
+        <w:t xml:space="preserve">,</w:t>
+      </w:r>
+      <w:r>
+        <w:t xml:space="preserve"> </w:t>
+      </w:r>
+      <w:hyperlink r:id="rId16">
+        <w:r>
+          <w:rPr>
+            <w:rStyle w:val="Hyperlink"/>
+          </w:rPr>
+          <w:t xml:space="preserve">differentiability</w:t>
+        </w:r>
+      </w:hyperlink>
+      <w:r>
+        <w:t xml:space="preserve">,</w:t>
+      </w:r>
+      <w:r>
+        <w:t xml:space="preserve"> </w:t>
+      </w:r>
+      <w:r>
+        <w:t xml:space="preserve">and</w:t>
+      </w:r>
+      <w:r>
+        <w:t xml:space="preserve"> </w:t>
+      </w:r>
+      <w:hyperlink r:id="rId17">
+        <w:r>
+          <w:rPr>
+            <w:rStyle w:val="Hyperlink"/>
+          </w:rPr>
+          <w:t xml:space="preserve">integrability</w:t>
+        </w:r>
+      </w:hyperlink>
+      <w:r>
+        <w:t xml:space="preserve"> </w:t>
+      </w:r>
+      <w:r>
+        <w:t xml:space="preserve">that results assume),</w:t>
       </w:r>
       <w:r>
         <w:t xml:space="preserve"> </w:t>
@@ -284,7 +355,7 @@
           <w:numId w:val="1001"/>
         </w:numPr>
       </w:pPr>
-      <w:hyperlink r:id="rId14">
+      <w:hyperlink r:id="rId18">
         <w:r>
           <w:rPr>
             <w:rStyle w:val="Hyperlink"/>
@@ -322,7 +393,7 @@
           <w:numId w:val="1001"/>
         </w:numPr>
       </w:pPr>
-      <w:hyperlink r:id="rId15">
+      <w:hyperlink r:id="rId19">
         <w:r>
           <w:rPr>
             <w:rStyle w:val="Hyperlink"/>
@@ -354,7 +425,7 @@
           <w:numId w:val="1001"/>
         </w:numPr>
       </w:pPr>
-      <w:hyperlink r:id="rId16">
+      <w:hyperlink r:id="rId20">
         <w:r>
           <w:rPr>
             <w:rStyle w:val="Hyperlink"/>
@@ -369,11 +440,22 @@
         <w:t xml:space="preserve"> </w:t>
       </w:r>
       <w:r>
-        <w:t xml:space="preserve">showing and annotating every step of a derivation</w:t>
-      </w:r>
+        <w:t xml:space="preserve">showing and annotating every step of a</w:t>
+      </w:r>
+      <w:r>
+        <w:t xml:space="preserve"> </w:t>
+      </w:r>
+      <w:hyperlink r:id="rId21">
+        <w:r>
+          <w:rPr>
+            <w:rStyle w:val="Hyperlink"/>
+          </w:rPr>
+          <w:t xml:space="preserve">derivation</w:t>
+        </w:r>
+      </w:hyperlink>
     </w:p>
-    <w:bookmarkEnd w:id="17"/>
-    <w:bookmarkStart w:id="23" w:name="further-reading"/>
+    <w:bookmarkEnd w:id="22"/>
+    <w:bookmarkStart w:id="28" w:name="further-reading"/>
     <w:p>
       <w:pPr>
         <w:pStyle w:val="Heading2"/>
@@ -398,7 +480,7 @@
           <w:numId w:val="1002"/>
         </w:numPr>
       </w:pPr>
-      <w:hyperlink r:id="rId18">
+      <w:hyperlink r:id="rId23">
         <w:r>
           <w:rPr>
             <w:rStyle w:val="Hyperlink"/>
@@ -440,7 +522,13 @@
         <w:t xml:space="preserve"> </w:t>
       </w:r>
       <w:r>
-        <w:t xml:space="preserve">Its chapters treat least squares, optimization,</w:t>
+        <w:t xml:space="preserve">Its chapters treat least squares,</w:t>
+      </w:r>
+      <w:r>
+        <w:t xml:space="preserve"> </w:t>
+      </w:r>
+      <w:r>
+        <w:t xml:space="preserve">optimization (finding where a function is smallest or largest),</w:t>
       </w:r>
       <w:r>
         <w:t xml:space="preserve"> </w:t>
@@ -469,7 +557,7 @@
           <w:numId w:val="1002"/>
         </w:numPr>
       </w:pPr>
-      <w:hyperlink r:id="rId19">
+      <w:hyperlink r:id="rId24">
         <w:r>
           <w:rPr>
             <w:rStyle w:val="Hyperlink"/>
@@ -498,7 +586,7 @@
       <w:r>
         <w:t xml:space="preserve"> </w:t>
       </w:r>
-      <w:hyperlink r:id="rId20">
+      <w:hyperlink r:id="rId25">
         <w:r>
           <w:rPr>
             <w:rStyle w:val="Hyperlink"/>
@@ -524,7 +612,7 @@
       <w:r>
         <w:t xml:space="preserve"> </w:t>
       </w:r>
-      <w:hyperlink r:id="rId21">
+      <w:hyperlink r:id="rId26">
         <w:r>
           <w:rPr>
             <w:rStyle w:val="Hyperlink"/>
@@ -559,7 +647,7 @@
       <w:r>
         <w:t xml:space="preserve"> </w:t>
       </w:r>
-      <w:hyperlink r:id="rId14">
+      <w:hyperlink r:id="rId18">
         <w:r>
           <w:rPr>
             <w:rStyle w:val="Hyperlink"/>
@@ -576,7 +664,7 @@
       <w:r>
         <w:t xml:space="preserve"> </w:t>
       </w:r>
-      <w:hyperlink r:id="rId15">
+      <w:hyperlink r:id="rId19">
         <w:r>
           <w:rPr>
             <w:rStyle w:val="Hyperlink"/>
@@ -599,7 +687,7 @@
           <w:numId w:val="1002"/>
         </w:numPr>
       </w:pPr>
-      <w:hyperlink r:id="rId22">
+      <w:hyperlink r:id="rId27">
         <w:r>
           <w:rPr>
             <w:rStyle w:val="Hyperlink"/>
@@ -634,7 +722,7 @@
       <w:r>
         <w:t xml:space="preserve"> </w:t>
       </w:r>
-      <w:hyperlink r:id="rId13">
+      <w:hyperlink r:id="rId14">
         <w:r>
           <w:rPr>
             <w:rStyle w:val="Hyperlink"/>
@@ -651,7 +739,7 @@
       <w:r>
         <w:t xml:space="preserve"> </w:t>
       </w:r>
-      <w:hyperlink r:id="rId15">
+      <w:hyperlink r:id="rId19">
         <w:r>
           <w:rPr>
             <w:rStyle w:val="Hyperlink"/>
@@ -672,8 +760,8 @@
         <w:t xml:space="preserve">Those pages link the individual videos in the sections they match.</w:t>
       </w:r>
     </w:p>
-    <w:bookmarkEnd w:id="23"/>
-    <w:bookmarkStart w:id="24" w:name="using-these-notes-in-another-site"/>
+    <w:bookmarkEnd w:id="28"/>
+    <w:bookmarkStart w:id="29" w:name="using-these-notes-in-another-site"/>
     <w:p>
       <w:pPr>
         <w:pStyle w:val="Heading2"/>
@@ -926,7 +1014,7 @@
             <w:pPr>
               <w:pStyle w:val="Compact"/>
             </w:pPr>
-            <w:hyperlink r:id="rId12">
+            <w:hyperlink r:id="rId13">
               <w:r>
                 <w:rPr>
                   <w:rStyle w:val="Hyperlink"/>
@@ -958,7 +1046,7 @@
             <w:pPr>
               <w:pStyle w:val="Compact"/>
             </w:pPr>
-            <w:hyperlink r:id="rId13">
+            <w:hyperlink r:id="rId14">
               <w:r>
                 <w:rPr>
                   <w:rStyle w:val="Hyperlink"/>
@@ -1014,7 +1102,7 @@
             <w:pPr>
               <w:pStyle w:val="Compact"/>
             </w:pPr>
-            <w:hyperlink r:id="rId14">
+            <w:hyperlink r:id="rId18">
               <w:r>
                 <w:rPr>
                   <w:rStyle w:val="Hyperlink"/>
@@ -1046,7 +1134,7 @@
             <w:pPr>
               <w:pStyle w:val="Compact"/>
             </w:pPr>
-            <w:hyperlink r:id="rId15">
+            <w:hyperlink r:id="rId19">
               <w:r>
                 <w:rPr>
                   <w:rStyle w:val="Hyperlink"/>
@@ -1078,7 +1166,7 @@
             <w:pPr>
               <w:pStyle w:val="Compact"/>
             </w:pPr>
-            <w:hyperlink r:id="rId16">
+            <w:hyperlink r:id="rId20">
               <w:r>
                 <w:rPr>
                   <w:rStyle w:val="Hyperlink"/>
@@ -1264,8 +1352,8 @@
         <w:t xml:space="preserve">.</w:t>
       </w:r>
     </w:p>
-    <w:bookmarkEnd w:id="24"/>
-    <w:bookmarkStart w:id="28" w:name="references"/>
+    <w:bookmarkEnd w:id="29"/>
+    <w:bookmarkStart w:id="33" w:name="references"/>
     <w:p>
       <w:pPr>
         <w:pStyle w:val="Heading2"/>
@@ -1274,8 +1362,8 @@
         <w:t xml:space="preserve">References</w:t>
       </w:r>
     </w:p>
-    <w:bookmarkStart w:id="27" w:name="refs"/>
-    <w:bookmarkStart w:id="26" w:name="ref-cheng2025math"/>
+    <w:bookmarkStart w:id="32" w:name="refs"/>
+    <w:bookmarkStart w:id="31" w:name="ref-cheng2025math"/>
     <w:p>
       <w:pPr>
         <w:pStyle w:val="Bibliography"/>
@@ -1317,7 +1405,7 @@
       <w:r>
         <w:t xml:space="preserve"> </w:t>
       </w:r>
-      <w:hyperlink r:id="rId25">
+      <w:hyperlink r:id="rId30">
         <w:r>
           <w:rPr>
             <w:rStyle w:val="Hyperlink"/>
@@ -1329,9 +1417,9 @@
         <w:t xml:space="preserve">.</w:t>
       </w:r>
     </w:p>
-    <w:bookmarkEnd w:id="26"/>
-    <w:bookmarkEnd w:id="27"/>
-    <w:bookmarkEnd w:id="28"/>
+    <w:bookmarkEnd w:id="31"/>
+    <w:bookmarkEnd w:id="32"/>
+    <w:bookmarkEnd w:id="33"/>
     <w:sectPr>
       <w:footnotePr>
         <w:numRestart w:val="eachSect"/>

</xml_diff>

<commit_message>
Deploying to gh-pages from @ Morrison-Lab/mds@b7200d46038c93654e9f5cb130cb4418ac2c6c34 🚀
</commit_message>
<xml_diff>
--- a/index.docx
+++ b/index.docx
@@ -15,7 +15,7 @@
         <w:pStyle w:val="Date"/>
       </w:pPr>
       <w:r>
-        <w:t xml:space="preserve">Last modified: 2026-10-06 17:25:57 (PDT)</w:t>
+        <w:t xml:space="preserve">Last modified: 2026-10-06 23:50:53 (PDT)</w:t>
       </w:r>
     </w:p>
     <w:bookmarkStart w:id="22" w:name="welcome"/>
@@ -455,7 +455,7 @@
       </w:hyperlink>
     </w:p>
     <w:bookmarkEnd w:id="22"/>
-    <w:bookmarkStart w:id="28" w:name="further-reading"/>
+    <w:bookmarkStart w:id="32" w:name="further-reading"/>
     <w:p>
       <w:pPr>
         <w:pStyle w:val="Heading2"/>
@@ -474,7 +474,6 @@
     </w:p>
     <w:p>
       <w:pPr>
-        <w:pStyle w:val="Compact"/>
         <w:numPr>
           <w:ilvl w:val="0"/>
           <w:numId w:val="1002"/>
@@ -551,7 +550,6 @@
     </w:p>
     <w:p>
       <w:pPr>
-        <w:pStyle w:val="Compact"/>
         <w:numPr>
           <w:ilvl w:val="0"/>
           <w:numId w:val="1002"/>
@@ -681,7 +679,6 @@
     </w:p>
     <w:p>
       <w:pPr>
-        <w:pStyle w:val="Compact"/>
         <w:numPr>
           <w:ilvl w:val="0"/>
           <w:numId w:val="1002"/>
@@ -760,8 +757,156 @@
         <w:t xml:space="preserve">Those pages link the individual videos in the sections they match.</w:t>
       </w:r>
     </w:p>
-    <w:bookmarkEnd w:id="28"/>
-    <w:bookmarkStart w:id="29" w:name="using-these-notes-in-another-site"/>
+    <w:p>
+      <w:pPr>
+        <w:numPr>
+          <w:ilvl w:val="0"/>
+          <w:numId w:val="1002"/>
+        </w:numPr>
+      </w:pPr>
+      <w:hyperlink r:id="rId28">
+        <w:r>
+          <w:rPr>
+            <w:rStyle w:val="Hyperlink"/>
+          </w:rPr>
+          <w:t xml:space="preserve">3Blue1Brown playlists</w:t>
+        </w:r>
+      </w:hyperlink>
+      <w:r>
+        <w:t xml:space="preserve"> </w:t>
+      </w:r>
+      <w:r>
+        <w:t xml:space="preserve">by Grant Sanderson produce animated visual explanations of core mathematical concepts.</w:t>
+      </w:r>
+      <w:r>
+        <w:t xml:space="preserve"> </w:t>
+      </w:r>
+      <w:r>
+        <w:t xml:space="preserve">Recommended playlists include:</w:t>
+      </w:r>
+    </w:p>
+    <w:p>
+      <w:pPr>
+        <w:pStyle w:val="Compact"/>
+        <w:numPr>
+          <w:ilvl w:val="1"/>
+          <w:numId w:val="1003"/>
+        </w:numPr>
+      </w:pPr>
+      <w:hyperlink r:id="rId29">
+        <w:r>
+          <w:rPr>
+            <w:rStyle w:val="Hyperlink"/>
+          </w:rPr>
+          <w:t xml:space="preserve">Essence of Linear Algebra</w:t>
+        </w:r>
+      </w:hyperlink>
+      <w:r>
+        <w:t xml:space="preserve"> </w:t>
+      </w:r>
+      <w:r>
+        <w:t xml:space="preserve">covers vectors, linear combinations, linear transformations, matrix multiplication, determinants, inverse matrices, dot and cross products, change of basis, and eigenvectors and eigenvalues, overlapping with our</w:t>
+      </w:r>
+      <w:r>
+        <w:t xml:space="preserve"> </w:t>
+      </w:r>
+      <w:hyperlink r:id="rId18">
+        <w:r>
+          <w:rPr>
+            <w:rStyle w:val="Hyperlink"/>
+          </w:rPr>
+          <w:t xml:space="preserve">linear algebra</w:t>
+        </w:r>
+      </w:hyperlink>
+      <w:r>
+        <w:t xml:space="preserve"> </w:t>
+      </w:r>
+      <w:r>
+        <w:t xml:space="preserve">page.</w:t>
+      </w:r>
+    </w:p>
+    <w:p>
+      <w:pPr>
+        <w:pStyle w:val="Compact"/>
+        <w:numPr>
+          <w:ilvl w:val="1"/>
+          <w:numId w:val="1003"/>
+        </w:numPr>
+      </w:pPr>
+      <w:hyperlink r:id="rId30">
+        <w:r>
+          <w:rPr>
+            <w:rStyle w:val="Hyperlink"/>
+          </w:rPr>
+          <w:t xml:space="preserve">Essence of Calculus</w:t>
+        </w:r>
+      </w:hyperlink>
+      <w:r>
+        <w:t xml:space="preserve"> </w:t>
+      </w:r>
+      <w:r>
+        <w:t xml:space="preserve">covers limits, derivatives, product and chain rules, implicit differentiation, integration, and Taylor series, overlapping with our</w:t>
+      </w:r>
+      <w:r>
+        <w:t xml:space="preserve"> </w:t>
+      </w:r>
+      <w:hyperlink r:id="rId14">
+        <w:r>
+          <w:rPr>
+            <w:rStyle w:val="Hyperlink"/>
+          </w:rPr>
+          <w:t xml:space="preserve">calculus</w:t>
+        </w:r>
+      </w:hyperlink>
+      <w:r>
+        <w:t xml:space="preserve"> </w:t>
+      </w:r>
+      <w:r>
+        <w:t xml:space="preserve">page.</w:t>
+      </w:r>
+    </w:p>
+    <w:p>
+      <w:pPr>
+        <w:pStyle w:val="Compact"/>
+        <w:numPr>
+          <w:ilvl w:val="1"/>
+          <w:numId w:val="1003"/>
+        </w:numPr>
+      </w:pPr>
+      <w:hyperlink r:id="rId31">
+        <w:r>
+          <w:rPr>
+            <w:rStyle w:val="Hyperlink"/>
+          </w:rPr>
+          <w:t xml:space="preserve">Neural Networks</w:t>
+        </w:r>
+      </w:hyperlink>
+      <w:r>
+        <w:t xml:space="preserve"> </w:t>
+      </w:r>
+      <w:r>
+        <w:t xml:space="preserve">covers gradient descent and backpropagation calculus, visualizing multivariable optimization in connection with our</w:t>
+      </w:r>
+      <w:r>
+        <w:t xml:space="preserve"> </w:t>
+      </w:r>
+      <w:hyperlink r:id="rId19">
+        <w:r>
+          <w:rPr>
+            <w:rStyle w:val="Hyperlink"/>
+          </w:rPr>
+          <w:t xml:space="preserve">vector calculus</w:t>
+        </w:r>
+      </w:hyperlink>
+      <w:r>
+        <w:t xml:space="preserve"> </w:t>
+      </w:r>
+      <w:r>
+        <w:t xml:space="preserve">page.</w:t>
+      </w:r>
+    </w:p>
+    <w:bookmarkEnd w:id="32"/>
+    <w:bookmarkStart w:id="33" w:name="using-these-notes-in-another-site"/>
     <w:p>
       <w:pPr>
         <w:pStyle w:val="Heading2"/>
@@ -1352,8 +1497,8 @@
         <w:t xml:space="preserve">.</w:t>
       </w:r>
     </w:p>
-    <w:bookmarkEnd w:id="29"/>
-    <w:bookmarkStart w:id="33" w:name="references"/>
+    <w:bookmarkEnd w:id="33"/>
+    <w:bookmarkStart w:id="37" w:name="references"/>
     <w:p>
       <w:pPr>
         <w:pStyle w:val="Heading2"/>
@@ -1362,8 +1507,8 @@
         <w:t xml:space="preserve">References</w:t>
       </w:r>
     </w:p>
-    <w:bookmarkStart w:id="32" w:name="refs"/>
-    <w:bookmarkStart w:id="31" w:name="ref-cheng2025math"/>
+    <w:bookmarkStart w:id="36" w:name="refs"/>
+    <w:bookmarkStart w:id="35" w:name="ref-cheng2025math"/>
     <w:p>
       <w:pPr>
         <w:pStyle w:val="Bibliography"/>
@@ -1405,7 +1550,7 @@
       <w:r>
         <w:t xml:space="preserve"> </w:t>
       </w:r>
-      <w:hyperlink r:id="rId30">
+      <w:hyperlink r:id="rId34">
         <w:r>
           <w:rPr>
             <w:rStyle w:val="Hyperlink"/>
@@ -1417,9 +1562,9 @@
         <w:t xml:space="preserve">.</w:t>
       </w:r>
     </w:p>
-    <w:bookmarkEnd w:id="31"/>
-    <w:bookmarkEnd w:id="32"/>
-    <w:bookmarkEnd w:id="33"/>
+    <w:bookmarkEnd w:id="35"/>
+    <w:bookmarkEnd w:id="36"/>
+    <w:bookmarkEnd w:id="37"/>
     <w:sectPr>
       <w:footnotePr>
         <w:numRestart w:val="eachSect"/>
@@ -1640,6 +1785,9 @@
     <w:abstractNumId w:val="991"/>
   </w:num>
   <w:num w:numId="1002">
+    <w:abstractNumId w:val="991"/>
+  </w:num>
+  <w:num w:numId="1003">
     <w:abstractNumId w:val="991"/>
   </w:num>
 </w:numbering>

</xml_diff>

<commit_message>
Deploying to gh-pages from @ Morrison-Lab/mds@b062be4e4aa67a40f21a6ade071b385f148eebd2 🚀
</commit_message>
<xml_diff>
--- a/index.docx
+++ b/index.docx
@@ -15,10 +15,10 @@
         <w:pStyle w:val="Date"/>
       </w:pPr>
       <w:r>
-        <w:t xml:space="preserve">Last modified: 2026-10-07 18:29:56 (PDT)</w:t>
-      </w:r>
-    </w:p>
-    <w:bookmarkStart w:id="22" w:name="welcome"/>
+        <w:t xml:space="preserve">Last modified: 2026-10-07 18:59:31 (PDT)</w:t>
+      </w:r>
+    </w:p>
+    <w:bookmarkStart w:id="23" w:name="welcome"/>
     <w:p>
       <w:pPr>
         <w:pStyle w:val="Heading2"/>
@@ -84,7 +84,7 @@
         <w:t xml:space="preserve"> </w:t>
       </w:r>
       <w:r>
-        <w:t xml:space="preserve">univariate calculus, linear algebra, vector calculus, and proof writing.</w:t>
+        <w:t xml:space="preserve">univariate calculus, linear algebra, vector calculus, optimization, and proof writing.</w:t>
       </w:r>
       <w:r>
         <w:t xml:space="preserve"> </w:t>
@@ -430,6 +430,38 @@
           <w:rPr>
             <w:rStyle w:val="Hyperlink"/>
           </w:rPr>
+          <w:t xml:space="preserve">Optimization</w:t>
+        </w:r>
+      </w:hyperlink>
+      <w:r>
+        <w:t xml:space="preserve">:</w:t>
+      </w:r>
+      <w:r>
+        <w:t xml:space="preserve"> </w:t>
+      </w:r>
+      <w:r>
+        <w:t xml:space="preserve">optimality conditions, Taylor approximations, convexity in several variables,</w:t>
+      </w:r>
+      <w:r>
+        <w:t xml:space="preserve"> </w:t>
+      </w:r>
+      <w:r>
+        <w:t xml:space="preserve">Lagrange multipliers, Newton’s method, and gradient descent</w:t>
+      </w:r>
+    </w:p>
+    <w:p>
+      <w:pPr>
+        <w:pStyle w:val="Compact"/>
+        <w:numPr>
+          <w:ilvl w:val="0"/>
+          <w:numId w:val="1001"/>
+        </w:numPr>
+      </w:pPr>
+      <w:hyperlink r:id="rId21">
+        <w:r>
+          <w:rPr>
+            <w:rStyle w:val="Hyperlink"/>
+          </w:rPr>
           <w:t xml:space="preserve">Proof Writing</w:t>
         </w:r>
       </w:hyperlink>
@@ -445,7 +477,7 @@
       <w:r>
         <w:t xml:space="preserve"> </w:t>
       </w:r>
-      <w:hyperlink r:id="rId21">
+      <w:hyperlink r:id="rId22">
         <w:r>
           <w:rPr>
             <w:rStyle w:val="Hyperlink"/>
@@ -454,8 +486,8 @@
         </w:r>
       </w:hyperlink>
     </w:p>
-    <w:bookmarkEnd w:id="22"/>
-    <w:bookmarkStart w:id="32" w:name="further-reading"/>
+    <w:bookmarkEnd w:id="23"/>
+    <w:bookmarkStart w:id="33" w:name="further-reading"/>
     <w:p>
       <w:pPr>
         <w:pStyle w:val="Heading2"/>
@@ -479,7 +511,7 @@
           <w:numId w:val="1002"/>
         </w:numPr>
       </w:pPr>
-      <w:hyperlink r:id="rId23">
+      <w:hyperlink r:id="rId24">
         <w:r>
           <w:rPr>
             <w:rStyle w:val="Hyperlink"/>
@@ -555,7 +587,7 @@
           <w:numId w:val="1002"/>
         </w:numPr>
       </w:pPr>
-      <w:hyperlink r:id="rId24">
+      <w:hyperlink r:id="rId25">
         <w:r>
           <w:rPr>
             <w:rStyle w:val="Hyperlink"/>
@@ -584,7 +616,7 @@
       <w:r>
         <w:t xml:space="preserve"> </w:t>
       </w:r>
-      <w:hyperlink r:id="rId25">
+      <w:hyperlink r:id="rId26">
         <w:r>
           <w:rPr>
             <w:rStyle w:val="Hyperlink"/>
@@ -610,7 +642,7 @@
       <w:r>
         <w:t xml:space="preserve"> </w:t>
       </w:r>
-      <w:hyperlink r:id="rId26">
+      <w:hyperlink r:id="rId27">
         <w:r>
           <w:rPr>
             <w:rStyle w:val="Hyperlink"/>
@@ -684,7 +716,7 @@
           <w:numId w:val="1002"/>
         </w:numPr>
       </w:pPr>
-      <w:hyperlink r:id="rId27">
+      <w:hyperlink r:id="rId28">
         <w:r>
           <w:rPr>
             <w:rStyle w:val="Hyperlink"/>
@@ -764,7 +796,7 @@
           <w:numId w:val="1002"/>
         </w:numPr>
       </w:pPr>
-      <w:hyperlink r:id="rId28">
+      <w:hyperlink r:id="rId29">
         <w:r>
           <w:rPr>
             <w:rStyle w:val="Hyperlink"/>
@@ -793,7 +825,7 @@
           <w:numId w:val="1003"/>
         </w:numPr>
       </w:pPr>
-      <w:hyperlink r:id="rId29">
+      <w:hyperlink r:id="rId30">
         <w:r>
           <w:rPr>
             <w:rStyle w:val="Hyperlink"/>
@@ -833,7 +865,7 @@
           <w:numId w:val="1003"/>
         </w:numPr>
       </w:pPr>
-      <w:hyperlink r:id="rId30">
+      <w:hyperlink r:id="rId31">
         <w:r>
           <w:rPr>
             <w:rStyle w:val="Hyperlink"/>
@@ -873,7 +905,7 @@
           <w:numId w:val="1003"/>
         </w:numPr>
       </w:pPr>
-      <w:hyperlink r:id="rId31">
+      <w:hyperlink r:id="rId32">
         <w:r>
           <w:rPr>
             <w:rStyle w:val="Hyperlink"/>
@@ -902,11 +934,28 @@
         <w:t xml:space="preserve"> </w:t>
       </w:r>
       <w:r>
-        <w:t xml:space="preserve">page.</w:t>
-      </w:r>
-    </w:p>
-    <w:bookmarkEnd w:id="32"/>
-    <w:bookmarkStart w:id="33" w:name="using-these-notes-in-another-site"/>
+        <w:t xml:space="preserve">and</w:t>
+      </w:r>
+      <w:r>
+        <w:t xml:space="preserve"> </w:t>
+      </w:r>
+      <w:hyperlink r:id="rId20">
+        <w:r>
+          <w:rPr>
+            <w:rStyle w:val="Hyperlink"/>
+          </w:rPr>
+          <w:t xml:space="preserve">optimization</w:t>
+        </w:r>
+      </w:hyperlink>
+      <w:r>
+        <w:t xml:space="preserve"> </w:t>
+      </w:r>
+      <w:r>
+        <w:t xml:space="preserve">pages.</w:t>
+      </w:r>
+    </w:p>
+    <w:bookmarkEnd w:id="33"/>
+    <w:bookmarkStart w:id="34" w:name="using-these-notes-in-another-site"/>
     <w:p>
       <w:pPr>
         <w:pStyle w:val="Heading2"/>
@@ -1316,6 +1365,38 @@
                 <w:rPr>
                   <w:rStyle w:val="Hyperlink"/>
                 </w:rPr>
+                <w:t xml:space="preserve">Optimization</w:t>
+              </w:r>
+            </w:hyperlink>
+          </w:p>
+        </w:tc>
+        <w:tc>
+          <w:tcPr/>
+          <w:p>
+            <w:pPr>
+              <w:pStyle w:val="Compact"/>
+            </w:pPr>
+            <w:r>
+              <w:rPr>
+                <w:rStyle w:val="VerbatimChar"/>
+              </w:rPr>
+              <w:t xml:space="preserve">mds/_subfiles/_sec_optimization.qmd</w:t>
+            </w:r>
+          </w:p>
+        </w:tc>
+      </w:tr>
+      <w:tr>
+        <w:tc>
+          <w:tcPr/>
+          <w:p>
+            <w:pPr>
+              <w:pStyle w:val="Compact"/>
+            </w:pPr>
+            <w:hyperlink r:id="rId21">
+              <w:r>
+                <w:rPr>
+                  <w:rStyle w:val="Hyperlink"/>
+                </w:rPr>
                 <w:t xml:space="preserve">Proof Writing</w:t>
               </w:r>
             </w:hyperlink>
@@ -1497,8 +1578,8 @@
         <w:t xml:space="preserve">.</w:t>
       </w:r>
     </w:p>
-    <w:bookmarkEnd w:id="33"/>
-    <w:bookmarkStart w:id="37" w:name="references"/>
+    <w:bookmarkEnd w:id="34"/>
+    <w:bookmarkStart w:id="38" w:name="references"/>
     <w:p>
       <w:pPr>
         <w:pStyle w:val="Heading2"/>
@@ -1507,8 +1588,8 @@
         <w:t xml:space="preserve">References</w:t>
       </w:r>
     </w:p>
-    <w:bookmarkStart w:id="36" w:name="refs"/>
-    <w:bookmarkStart w:id="35" w:name="ref-cheng2025math"/>
+    <w:bookmarkStart w:id="37" w:name="refs"/>
+    <w:bookmarkStart w:id="36" w:name="ref-cheng2025math"/>
     <w:p>
       <w:pPr>
         <w:pStyle w:val="Bibliography"/>
@@ -1550,7 +1631,7 @@
       <w:r>
         <w:t xml:space="preserve"> </w:t>
       </w:r>
-      <w:hyperlink r:id="rId34">
+      <w:hyperlink r:id="rId35">
         <w:r>
           <w:rPr>
             <w:rStyle w:val="Hyperlink"/>
@@ -1562,9 +1643,9 @@
         <w:t xml:space="preserve">.</w:t>
       </w:r>
     </w:p>
-    <w:bookmarkEnd w:id="35"/>
     <w:bookmarkEnd w:id="36"/>
     <w:bookmarkEnd w:id="37"/>
+    <w:bookmarkEnd w:id="38"/>
     <w:sectPr>
       <w:footnotePr>
         <w:numRestart w:val="eachSect"/>

</xml_diff>

<commit_message>
Deploying to gh-pages from @ Morrison-Lab/mds@f1603b4cab82f237da780c42be4d64fd78f890d2 🚀
</commit_message>
<xml_diff>
--- a/index.docx
+++ b/index.docx
@@ -15,7 +15,7 @@
         <w:pStyle w:val="Date"/>
       </w:pPr>
       <w:r>
-        <w:t xml:space="preserve">Last modified: 2026-10-13 14:29:41 (PDT)</w:t>
+        <w:t xml:space="preserve">Last modified: 2026-10-13 15:25:57 (PDT)</w:t>
       </w:r>
     </w:p>
     <w:bookmarkStart w:id="23" w:name="welcome"/>
@@ -128,7 +128,7 @@
         <w:t xml:space="preserve"> </w:t>
       </w:r>
       <w:r>
-        <w:t xml:space="preserve">proof symbols, and indicator functions</w:t>
+        <w:t xml:space="preserve">and indicator functions</w:t>
       </w:r>
     </w:p>
     <w:p>
@@ -472,7 +472,7 @@
         <w:t xml:space="preserve"> </w:t>
       </w:r>
       <w:r>
-        <w:t xml:space="preserve">showing and annotating every step of a</w:t>
+        <w:t xml:space="preserve">propositions, quantifiers, proofs and derivations, and showing and annotating every step of a</w:t>
       </w:r>
       <w:r>
         <w:t xml:space="preserve"> </w:t>

</xml_diff>

<commit_message>
Deploying to gh-pages from @ Morrison-Lab/mds@2f26d513010084682c0d06e56da465405acea587 🚀
</commit_message>
<xml_diff>
--- a/index.docx
+++ b/index.docx
@@ -15,10 +15,10 @@
         <w:pStyle w:val="Date"/>
       </w:pPr>
       <w:r>
-        <w:t xml:space="preserve">Last modified: 2026-10-15 16:26:25 (PDT)</w:t>
-      </w:r>
-    </w:p>
-    <w:bookmarkStart w:id="23" w:name="welcome"/>
+        <w:t xml:space="preserve">Last modified: 2026-10-15 17:47:31 (PDT)</w:t>
+      </w:r>
+    </w:p>
+    <w:bookmarkStart w:id="24" w:name="welcome"/>
     <w:p>
       <w:pPr>
         <w:pStyle w:val="Heading2"/>
@@ -122,7 +122,7 @@
         <w:t xml:space="preserve"> </w:t>
       </w:r>
       <w:r>
-        <w:t xml:space="preserve">common symbols, natural numbers, the percent sign,</w:t>
+        <w:t xml:space="preserve">common symbols, the percent sign,</w:t>
       </w:r>
       <w:r>
         <w:t xml:space="preserve"> </w:t>
@@ -144,7 +144,7 @@
           <w:rPr>
             <w:rStyle w:val="Hyperlink"/>
           </w:rPr>
-          <w:t xml:space="preserve">Sets and Functions</w:t>
+          <w:t xml:space="preserve">Number Systems</w:t>
         </w:r>
       </w:hyperlink>
       <w:r>
@@ -154,25 +154,13 @@
         <w:t xml:space="preserve"> </w:t>
       </w:r>
       <w:r>
-        <w:t xml:space="preserve">sets, subsets and supersets, the empty set,</w:t>
-      </w:r>
-      <w:r>
-        <w:t xml:space="preserve"> </w:t>
-      </w:r>
-      <w:r>
-        <w:t xml:space="preserve">unions, intersections, and set differences, countable sets,</w:t>
-      </w:r>
-      <w:r>
-        <w:t xml:space="preserve"> </w:t>
-      </w:r>
-      <w:r>
-        <w:t xml:space="preserve">functions with their domains, codomains, and images,</w:t>
-      </w:r>
-      <w:r>
-        <w:t xml:space="preserve"> </w:t>
-      </w:r>
-      <w:r>
-        <w:t xml:space="preserve">and the extended non-negative real numbers</w:t>
+        <w:t xml:space="preserve">the integers, natural numbers, even and odd numbers,</w:t>
+      </w:r>
+      <w:r>
+        <w:t xml:space="preserve"> </w:t>
+      </w:r>
+      <w:r>
+        <w:t xml:space="preserve">and the rational, real, and irrational numbers</w:t>
       </w:r>
     </w:p>
     <w:p>
@@ -188,7 +176,7 @@
           <w:rPr>
             <w:rStyle w:val="Hyperlink"/>
           </w:rPr>
-          <w:t xml:space="preserve">Algebra</w:t>
+          <w:t xml:space="preserve">Sets and Functions</w:t>
         </w:r>
       </w:hyperlink>
       <w:r>
@@ -198,27 +186,25 @@
         <w:t xml:space="preserve"> </w:t>
       </w:r>
       <w:r>
-        <w:t xml:space="preserve">equalities and</w:t>
-      </w:r>
-      <w:r>
-        <w:t xml:space="preserve"> </w:t>
-      </w:r>
-      <w:hyperlink r:id="rId12">
-        <w:r>
-          <w:rPr>
-            <w:rStyle w:val="Hyperlink"/>
-          </w:rPr>
-          <w:t xml:space="preserve">inequalities</w:t>
-        </w:r>
-      </w:hyperlink>
-      <w:r>
-        <w:t xml:space="preserve">, infimum and supremum,</w:t>
-      </w:r>
-      <w:r>
-        <w:t xml:space="preserve"> </w:t>
-      </w:r>
-      <w:r>
-        <w:t xml:space="preserve">sums, products, quotients, exponentials and logarithms</w:t>
+        <w:t xml:space="preserve">sets, subsets and supersets, the empty set,</w:t>
+      </w:r>
+      <w:r>
+        <w:t xml:space="preserve"> </w:t>
+      </w:r>
+      <w:r>
+        <w:t xml:space="preserve">unions, intersections, and set differences, countable sets,</w:t>
+      </w:r>
+      <w:r>
+        <w:t xml:space="preserve"> </w:t>
+      </w:r>
+      <w:r>
+        <w:t xml:space="preserve">functions with their domains, codomains, and images,</w:t>
+      </w:r>
+      <w:r>
+        <w:t xml:space="preserve"> </w:t>
+      </w:r>
+      <w:r>
+        <w:t xml:space="preserve">and the extended non-negative real numbers</w:t>
       </w:r>
     </w:p>
     <w:p>
@@ -229,7 +215,53 @@
           <w:numId w:val="1001"/>
         </w:numPr>
       </w:pPr>
+      <w:hyperlink r:id="rId12">
+        <w:r>
+          <w:rPr>
+            <w:rStyle w:val="Hyperlink"/>
+          </w:rPr>
+          <w:t xml:space="preserve">Algebra</w:t>
+        </w:r>
+      </w:hyperlink>
+      <w:r>
+        <w:t xml:space="preserve">:</w:t>
+      </w:r>
+      <w:r>
+        <w:t xml:space="preserve"> </w:t>
+      </w:r>
+      <w:r>
+        <w:t xml:space="preserve">equalities and</w:t>
+      </w:r>
+      <w:r>
+        <w:t xml:space="preserve"> </w:t>
+      </w:r>
       <w:hyperlink r:id="rId13">
+        <w:r>
+          <w:rPr>
+            <w:rStyle w:val="Hyperlink"/>
+          </w:rPr>
+          <w:t xml:space="preserve">inequalities</w:t>
+        </w:r>
+      </w:hyperlink>
+      <w:r>
+        <w:t xml:space="preserve">, infimum and supremum,</w:t>
+      </w:r>
+      <w:r>
+        <w:t xml:space="preserve"> </w:t>
+      </w:r>
+      <w:r>
+        <w:t xml:space="preserve">sums, products, quotients, exponentials and logarithms</w:t>
+      </w:r>
+    </w:p>
+    <w:p>
+      <w:pPr>
+        <w:pStyle w:val="Compact"/>
+        <w:numPr>
+          <w:ilvl w:val="0"/>
+          <w:numId w:val="1001"/>
+        </w:numPr>
+      </w:pPr>
+      <w:hyperlink r:id="rId14">
         <w:r>
           <w:rPr>
             <w:rStyle w:val="Hyperlink"/>
@@ -266,7 +298,7 @@
           <w:numId w:val="1001"/>
         </w:numPr>
       </w:pPr>
-      <w:hyperlink r:id="rId14">
+      <w:hyperlink r:id="rId15">
         <w:r>
           <w:rPr>
             <w:rStyle w:val="Hyperlink"/>
@@ -292,7 +324,7 @@
       <w:r>
         <w:t xml:space="preserve"> </w:t>
       </w:r>
-      <w:hyperlink r:id="rId15">
+      <w:hyperlink r:id="rId16">
         <w:r>
           <w:rPr>
             <w:rStyle w:val="Hyperlink"/>
@@ -306,7 +338,7 @@
       <w:r>
         <w:t xml:space="preserve"> </w:t>
       </w:r>
-      <w:hyperlink r:id="rId16">
+      <w:hyperlink r:id="rId17">
         <w:r>
           <w:rPr>
             <w:rStyle w:val="Hyperlink"/>
@@ -326,7 +358,7 @@
       <w:r>
         <w:t xml:space="preserve"> </w:t>
       </w:r>
-      <w:hyperlink r:id="rId17">
+      <w:hyperlink r:id="rId18">
         <w:r>
           <w:rPr>
             <w:rStyle w:val="Hyperlink"/>
@@ -355,7 +387,7 @@
           <w:numId w:val="1001"/>
         </w:numPr>
       </w:pPr>
-      <w:hyperlink r:id="rId18">
+      <w:hyperlink r:id="rId19">
         <w:r>
           <w:rPr>
             <w:rStyle w:val="Hyperlink"/>
@@ -393,7 +425,7 @@
           <w:numId w:val="1001"/>
         </w:numPr>
       </w:pPr>
-      <w:hyperlink r:id="rId19">
+      <w:hyperlink r:id="rId20">
         <w:r>
           <w:rPr>
             <w:rStyle w:val="Hyperlink"/>
@@ -425,7 +457,7 @@
           <w:numId w:val="1001"/>
         </w:numPr>
       </w:pPr>
-      <w:hyperlink r:id="rId20">
+      <w:hyperlink r:id="rId21">
         <w:r>
           <w:rPr>
             <w:rStyle w:val="Hyperlink"/>
@@ -457,7 +489,7 @@
           <w:numId w:val="1001"/>
         </w:numPr>
       </w:pPr>
-      <w:hyperlink r:id="rId21">
+      <w:hyperlink r:id="rId22">
         <w:r>
           <w:rPr>
             <w:rStyle w:val="Hyperlink"/>
@@ -477,7 +509,7 @@
       <w:r>
         <w:t xml:space="preserve"> </w:t>
       </w:r>
-      <w:hyperlink r:id="rId22">
+      <w:hyperlink r:id="rId23">
         <w:r>
           <w:rPr>
             <w:rStyle w:val="Hyperlink"/>
@@ -486,8 +518,8 @@
         </w:r>
       </w:hyperlink>
     </w:p>
-    <w:bookmarkEnd w:id="23"/>
-    <w:bookmarkStart w:id="33" w:name="further-reading"/>
+    <w:bookmarkEnd w:id="24"/>
+    <w:bookmarkStart w:id="34" w:name="further-reading"/>
     <w:p>
       <w:pPr>
         <w:pStyle w:val="Heading2"/>
@@ -511,7 +543,7 @@
           <w:numId w:val="1002"/>
         </w:numPr>
       </w:pPr>
-      <w:hyperlink r:id="rId24">
+      <w:hyperlink r:id="rId25">
         <w:r>
           <w:rPr>
             <w:rStyle w:val="Hyperlink"/>
@@ -587,7 +619,7 @@
           <w:numId w:val="1002"/>
         </w:numPr>
       </w:pPr>
-      <w:hyperlink r:id="rId25">
+      <w:hyperlink r:id="rId26">
         <w:r>
           <w:rPr>
             <w:rStyle w:val="Hyperlink"/>
@@ -616,7 +648,7 @@
       <w:r>
         <w:t xml:space="preserve"> </w:t>
       </w:r>
-      <w:hyperlink r:id="rId26">
+      <w:hyperlink r:id="rId27">
         <w:r>
           <w:rPr>
             <w:rStyle w:val="Hyperlink"/>
@@ -642,7 +674,7 @@
       <w:r>
         <w:t xml:space="preserve"> </w:t>
       </w:r>
-      <w:hyperlink r:id="rId27">
+      <w:hyperlink r:id="rId28">
         <w:r>
           <w:rPr>
             <w:rStyle w:val="Hyperlink"/>
@@ -677,7 +709,7 @@
       <w:r>
         <w:t xml:space="preserve"> </w:t>
       </w:r>
-      <w:hyperlink r:id="rId18">
+      <w:hyperlink r:id="rId19">
         <w:r>
           <w:rPr>
             <w:rStyle w:val="Hyperlink"/>
@@ -694,7 +726,7 @@
       <w:r>
         <w:t xml:space="preserve"> </w:t>
       </w:r>
-      <w:hyperlink r:id="rId19">
+      <w:hyperlink r:id="rId20">
         <w:r>
           <w:rPr>
             <w:rStyle w:val="Hyperlink"/>
@@ -716,7 +748,7 @@
           <w:numId w:val="1002"/>
         </w:numPr>
       </w:pPr>
-      <w:hyperlink r:id="rId28">
+      <w:hyperlink r:id="rId29">
         <w:r>
           <w:rPr>
             <w:rStyle w:val="Hyperlink"/>
@@ -751,7 +783,7 @@
       <w:r>
         <w:t xml:space="preserve"> </w:t>
       </w:r>
-      <w:hyperlink r:id="rId14">
+      <w:hyperlink r:id="rId15">
         <w:r>
           <w:rPr>
             <w:rStyle w:val="Hyperlink"/>
@@ -768,7 +800,7 @@
       <w:r>
         <w:t xml:space="preserve"> </w:t>
       </w:r>
-      <w:hyperlink r:id="rId19">
+      <w:hyperlink r:id="rId20">
         <w:r>
           <w:rPr>
             <w:rStyle w:val="Hyperlink"/>
@@ -796,7 +828,7 @@
           <w:numId w:val="1002"/>
         </w:numPr>
       </w:pPr>
-      <w:hyperlink r:id="rId29">
+      <w:hyperlink r:id="rId30">
         <w:r>
           <w:rPr>
             <w:rStyle w:val="Hyperlink"/>
@@ -825,7 +857,7 @@
           <w:numId w:val="1003"/>
         </w:numPr>
       </w:pPr>
-      <w:hyperlink r:id="rId30">
+      <w:hyperlink r:id="rId31">
         <w:r>
           <w:rPr>
             <w:rStyle w:val="Hyperlink"/>
@@ -842,7 +874,7 @@
       <w:r>
         <w:t xml:space="preserve"> </w:t>
       </w:r>
-      <w:hyperlink r:id="rId18">
+      <w:hyperlink r:id="rId19">
         <w:r>
           <w:rPr>
             <w:rStyle w:val="Hyperlink"/>
@@ -865,7 +897,7 @@
           <w:numId w:val="1003"/>
         </w:numPr>
       </w:pPr>
-      <w:hyperlink r:id="rId31">
+      <w:hyperlink r:id="rId32">
         <w:r>
           <w:rPr>
             <w:rStyle w:val="Hyperlink"/>
@@ -882,7 +914,7 @@
       <w:r>
         <w:t xml:space="preserve"> </w:t>
       </w:r>
-      <w:hyperlink r:id="rId14">
+      <w:hyperlink r:id="rId15">
         <w:r>
           <w:rPr>
             <w:rStyle w:val="Hyperlink"/>
@@ -905,7 +937,7 @@
           <w:numId w:val="1003"/>
         </w:numPr>
       </w:pPr>
-      <w:hyperlink r:id="rId32">
+      <w:hyperlink r:id="rId33">
         <w:r>
           <w:rPr>
             <w:rStyle w:val="Hyperlink"/>
@@ -922,7 +954,7 @@
       <w:r>
         <w:t xml:space="preserve"> </w:t>
       </w:r>
-      <w:hyperlink r:id="rId19">
+      <w:hyperlink r:id="rId20">
         <w:r>
           <w:rPr>
             <w:rStyle w:val="Hyperlink"/>
@@ -939,7 +971,7 @@
       <w:r>
         <w:t xml:space="preserve"> </w:t>
       </w:r>
-      <w:hyperlink r:id="rId20">
+      <w:hyperlink r:id="rId21">
         <w:r>
           <w:rPr>
             <w:rStyle w:val="Hyperlink"/>
@@ -954,8 +986,8 @@
         <w:t xml:space="preserve">pages.</w:t>
       </w:r>
     </w:p>
-    <w:bookmarkEnd w:id="33"/>
-    <w:bookmarkStart w:id="34" w:name="using-these-notes-in-another-site"/>
+    <w:bookmarkEnd w:id="34"/>
+    <w:bookmarkStart w:id="35" w:name="using-these-notes-in-another-site"/>
     <w:p>
       <w:pPr>
         <w:pStyle w:val="Heading2"/>
@@ -1149,6 +1181,38 @@
                 <w:rPr>
                   <w:rStyle w:val="Hyperlink"/>
                 </w:rPr>
+                <w:t xml:space="preserve">Number Systems</w:t>
+              </w:r>
+            </w:hyperlink>
+          </w:p>
+        </w:tc>
+        <w:tc>
+          <w:tcPr/>
+          <w:p>
+            <w:pPr>
+              <w:pStyle w:val="Compact"/>
+            </w:pPr>
+            <w:r>
+              <w:rPr>
+                <w:rStyle w:val="VerbatimChar"/>
+              </w:rPr>
+              <w:t xml:space="preserve">mds/_number-systems.qmd</w:t>
+            </w:r>
+          </w:p>
+        </w:tc>
+      </w:tr>
+      <w:tr>
+        <w:tc>
+          <w:tcPr/>
+          <w:p>
+            <w:pPr>
+              <w:pStyle w:val="Compact"/>
+            </w:pPr>
+            <w:hyperlink r:id="rId11">
+              <w:r>
+                <w:rPr>
+                  <w:rStyle w:val="Hyperlink"/>
+                </w:rPr>
                 <w:t xml:space="preserve">Sets and Functions</w:t>
               </w:r>
             </w:hyperlink>
@@ -1176,7 +1240,7 @@
             <w:pPr>
               <w:pStyle w:val="Compact"/>
             </w:pPr>
-            <w:hyperlink r:id="rId11">
+            <w:hyperlink r:id="rId12">
               <w:r>
                 <w:rPr>
                   <w:rStyle w:val="Hyperlink"/>
@@ -1208,7 +1272,7 @@
             <w:pPr>
               <w:pStyle w:val="Compact"/>
             </w:pPr>
-            <w:hyperlink r:id="rId13">
+            <w:hyperlink r:id="rId14">
               <w:r>
                 <w:rPr>
                   <w:rStyle w:val="Hyperlink"/>
@@ -1240,7 +1304,7 @@
             <w:pPr>
               <w:pStyle w:val="Compact"/>
             </w:pPr>
-            <w:hyperlink r:id="rId14">
+            <w:hyperlink r:id="rId15">
               <w:r>
                 <w:rPr>
                   <w:rStyle w:val="Hyperlink"/>
@@ -1296,7 +1360,7 @@
             <w:pPr>
               <w:pStyle w:val="Compact"/>
             </w:pPr>
-            <w:hyperlink r:id="rId18">
+            <w:hyperlink r:id="rId19">
               <w:r>
                 <w:rPr>
                   <w:rStyle w:val="Hyperlink"/>
@@ -1328,7 +1392,7 @@
             <w:pPr>
               <w:pStyle w:val="Compact"/>
             </w:pPr>
-            <w:hyperlink r:id="rId19">
+            <w:hyperlink r:id="rId20">
               <w:r>
                 <w:rPr>
                   <w:rStyle w:val="Hyperlink"/>
@@ -1360,7 +1424,7 @@
             <w:pPr>
               <w:pStyle w:val="Compact"/>
             </w:pPr>
-            <w:hyperlink r:id="rId20">
+            <w:hyperlink r:id="rId21">
               <w:r>
                 <w:rPr>
                   <w:rStyle w:val="Hyperlink"/>
@@ -1392,7 +1456,7 @@
             <w:pPr>
               <w:pStyle w:val="Compact"/>
             </w:pPr>
-            <w:hyperlink r:id="rId21">
+            <w:hyperlink r:id="rId22">
               <w:r>
                 <w:rPr>
                   <w:rStyle w:val="Hyperlink"/>
@@ -1438,6 +1502,18 @@
         <w:rPr>
           <w:rStyle w:val="VerbatimChar"/>
         </w:rPr>
+        <w:t xml:space="preserve">_number-systems.qmd</w:t>
+      </w:r>
+      <w:r>
+        <w:t xml:space="preserve">,</w:t>
+      </w:r>
+      <w:r>
+        <w:t xml:space="preserve"> </w:t>
+      </w:r>
+      <w:r>
+        <w:rPr>
+          <w:rStyle w:val="VerbatimChar"/>
+        </w:rPr>
         <w:t xml:space="preserve">_sets-functions.qmd</w:t>
       </w:r>
       <w:r>
@@ -1578,8 +1654,8 @@
         <w:t xml:space="preserve">.</w:t>
       </w:r>
     </w:p>
-    <w:bookmarkEnd w:id="34"/>
-    <w:bookmarkStart w:id="38" w:name="references"/>
+    <w:bookmarkEnd w:id="35"/>
+    <w:bookmarkStart w:id="39" w:name="references"/>
     <w:p>
       <w:pPr>
         <w:pStyle w:val="Heading2"/>
@@ -1588,8 +1664,8 @@
         <w:t xml:space="preserve">References</w:t>
       </w:r>
     </w:p>
-    <w:bookmarkStart w:id="37" w:name="refs"/>
-    <w:bookmarkStart w:id="36" w:name="ref-cheng2025math"/>
+    <w:bookmarkStart w:id="38" w:name="refs"/>
+    <w:bookmarkStart w:id="37" w:name="ref-cheng2025math"/>
     <w:p>
       <w:pPr>
         <w:pStyle w:val="Bibliography"/>
@@ -1631,7 +1707,7 @@
       <w:r>
         <w:t xml:space="preserve"> </w:t>
       </w:r>
-      <w:hyperlink r:id="rId35">
+      <w:hyperlink r:id="rId36">
         <w:r>
           <w:rPr>
             <w:rStyle w:val="Hyperlink"/>
@@ -1643,9 +1719,9 @@
         <w:t xml:space="preserve">.</w:t>
       </w:r>
     </w:p>
-    <w:bookmarkEnd w:id="36"/>
     <w:bookmarkEnd w:id="37"/>
     <w:bookmarkEnd w:id="38"/>
+    <w:bookmarkEnd w:id="39"/>
     <w:sectPr>
       <w:footnotePr>
         <w:numRestart w:val="eachSect"/>

</xml_diff>

<commit_message>
Deploying to gh-pages from @ Morrison-Lab/mds@d5d4155dc459f429bde05d56cbb629a0a5df31d3 🚀
</commit_message>
<xml_diff>
--- a/index.docx
+++ b/index.docx
@@ -15,10 +15,10 @@
         <w:pStyle w:val="Date"/>
       </w:pPr>
       <w:r>
-        <w:t xml:space="preserve">Last modified: 2026-10-15 18:37:38 (PDT)</w:t>
-      </w:r>
-    </w:p>
-    <w:bookmarkStart w:id="24" w:name="welcome"/>
+        <w:t xml:space="preserve">Last modified: 2026-10-15 19:41:40 (PDT)</w:t>
+      </w:r>
+    </w:p>
+    <w:bookmarkStart w:id="27" w:name="welcome"/>
     <w:p>
       <w:pPr>
         <w:pStyle w:val="Heading2"/>
@@ -180,6 +180,26 @@
         </w:r>
       </w:hyperlink>
       <w:r>
+        <w:t xml:space="preserve">, on three pages:</w:t>
+      </w:r>
+    </w:p>
+    <w:p>
+      <w:pPr>
+        <w:pStyle w:val="Compact"/>
+        <w:numPr>
+          <w:ilvl w:val="1"/>
+          <w:numId w:val="1002"/>
+        </w:numPr>
+      </w:pPr>
+      <w:hyperlink r:id="rId12">
+        <w:r>
+          <w:rPr>
+            <w:rStyle w:val="Hyperlink"/>
+          </w:rPr>
+          <w:t xml:space="preserve">Sets</w:t>
+        </w:r>
+      </w:hyperlink>
+      <w:r>
         <w:t xml:space="preserve">:</w:t>
       </w:r>
       <w:r>
@@ -192,19 +212,65 @@
         <w:t xml:space="preserve"> </w:t>
       </w:r>
       <w:r>
-        <w:t xml:space="preserve">unions, intersections, and set differences, countable sets,</w:t>
-      </w:r>
-      <w:r>
-        <w:t xml:space="preserve"> </w:t>
-      </w:r>
-      <w:r>
-        <w:t xml:space="preserve">functions with their domains, codomains, and images,</w:t>
+        <w:t xml:space="preserve">unions, intersections, and set differences,</w:t>
       </w:r>
       <w:r>
         <w:t xml:space="preserve"> </w:t>
       </w:r>
       <w:r>
         <w:t xml:space="preserve">and the extended non-negative real numbers</w:t>
+      </w:r>
+    </w:p>
+    <w:p>
+      <w:pPr>
+        <w:pStyle w:val="Compact"/>
+        <w:numPr>
+          <w:ilvl w:val="1"/>
+          <w:numId w:val="1002"/>
+        </w:numPr>
+      </w:pPr>
+      <w:hyperlink r:id="rId13">
+        <w:r>
+          <w:rPr>
+            <w:rStyle w:val="Hyperlink"/>
+          </w:rPr>
+          <w:t xml:space="preserve">Functions</w:t>
+        </w:r>
+      </w:hyperlink>
+      <w:r>
+        <w:t xml:space="preserve">:</w:t>
+      </w:r>
+      <w:r>
+        <w:t xml:space="preserve"> </w:t>
+      </w:r>
+      <w:r>
+        <w:t xml:space="preserve">functions with their domains, codomains, and images, sequences, and countable sets</w:t>
+      </w:r>
+    </w:p>
+    <w:p>
+      <w:pPr>
+        <w:pStyle w:val="Compact"/>
+        <w:numPr>
+          <w:ilvl w:val="1"/>
+          <w:numId w:val="1002"/>
+        </w:numPr>
+      </w:pPr>
+      <w:hyperlink r:id="rId14">
+        <w:r>
+          <w:rPr>
+            <w:rStyle w:val="Hyperlink"/>
+          </w:rPr>
+          <w:t xml:space="preserve">Expressions and Algorithms</w:t>
+        </w:r>
+      </w:hyperlink>
+      <w:r>
+        <w:t xml:space="preserve">:</w:t>
+      </w:r>
+      <w:r>
+        <w:t xml:space="preserve"> </w:t>
+      </w:r>
+      <w:r>
+        <w:t xml:space="preserve">expressions, parse trees, and algorithms</w:t>
       </w:r>
     </w:p>
     <w:p>
@@ -215,7 +281,7 @@
           <w:numId w:val="1001"/>
         </w:numPr>
       </w:pPr>
-      <w:hyperlink r:id="rId12">
+      <w:hyperlink r:id="rId15">
         <w:r>
           <w:rPr>
             <w:rStyle w:val="Hyperlink"/>
@@ -235,7 +301,7 @@
       <w:r>
         <w:t xml:space="preserve"> </w:t>
       </w:r>
-      <w:hyperlink r:id="rId13">
+      <w:hyperlink r:id="rId16">
         <w:r>
           <w:rPr>
             <w:rStyle w:val="Hyperlink"/>
@@ -261,7 +327,7 @@
           <w:numId w:val="1001"/>
         </w:numPr>
       </w:pPr>
-      <w:hyperlink r:id="rId14">
+      <w:hyperlink r:id="rId17">
         <w:r>
           <w:rPr>
             <w:rStyle w:val="Hyperlink"/>
@@ -298,7 +364,7 @@
           <w:numId w:val="1001"/>
         </w:numPr>
       </w:pPr>
-      <w:hyperlink r:id="rId15">
+      <w:hyperlink r:id="rId18">
         <w:r>
           <w:rPr>
             <w:rStyle w:val="Hyperlink"/>
@@ -324,7 +390,7 @@
       <w:r>
         <w:t xml:space="preserve"> </w:t>
       </w:r>
-      <w:hyperlink r:id="rId16">
+      <w:hyperlink r:id="rId19">
         <w:r>
           <w:rPr>
             <w:rStyle w:val="Hyperlink"/>
@@ -338,7 +404,7 @@
       <w:r>
         <w:t xml:space="preserve"> </w:t>
       </w:r>
-      <w:hyperlink r:id="rId17">
+      <w:hyperlink r:id="rId20">
         <w:r>
           <w:rPr>
             <w:rStyle w:val="Hyperlink"/>
@@ -358,7 +424,7 @@
       <w:r>
         <w:t xml:space="preserve"> </w:t>
       </w:r>
-      <w:hyperlink r:id="rId18">
+      <w:hyperlink r:id="rId21">
         <w:r>
           <w:rPr>
             <w:rStyle w:val="Hyperlink"/>
@@ -387,7 +453,7 @@
           <w:numId w:val="1001"/>
         </w:numPr>
       </w:pPr>
-      <w:hyperlink r:id="rId19">
+      <w:hyperlink r:id="rId22">
         <w:r>
           <w:rPr>
             <w:rStyle w:val="Hyperlink"/>
@@ -425,7 +491,7 @@
           <w:numId w:val="1001"/>
         </w:numPr>
       </w:pPr>
-      <w:hyperlink r:id="rId20">
+      <w:hyperlink r:id="rId23">
         <w:r>
           <w:rPr>
             <w:rStyle w:val="Hyperlink"/>
@@ -457,7 +523,7 @@
           <w:numId w:val="1001"/>
         </w:numPr>
       </w:pPr>
-      <w:hyperlink r:id="rId21">
+      <w:hyperlink r:id="rId24">
         <w:r>
           <w:rPr>
             <w:rStyle w:val="Hyperlink"/>
@@ -489,7 +555,7 @@
           <w:numId w:val="1001"/>
         </w:numPr>
       </w:pPr>
-      <w:hyperlink r:id="rId22">
+      <w:hyperlink r:id="rId25">
         <w:r>
           <w:rPr>
             <w:rStyle w:val="Hyperlink"/>
@@ -509,7 +575,7 @@
       <w:r>
         <w:t xml:space="preserve"> </w:t>
       </w:r>
-      <w:hyperlink r:id="rId23">
+      <w:hyperlink r:id="rId26">
         <w:r>
           <w:rPr>
             <w:rStyle w:val="Hyperlink"/>
@@ -518,8 +584,8 @@
         </w:r>
       </w:hyperlink>
     </w:p>
-    <w:bookmarkEnd w:id="24"/>
-    <w:bookmarkStart w:id="34" w:name="further-reading"/>
+    <w:bookmarkEnd w:id="27"/>
+    <w:bookmarkStart w:id="37" w:name="further-reading"/>
     <w:p>
       <w:pPr>
         <w:pStyle w:val="Heading2"/>
@@ -540,10 +606,10 @@
       <w:pPr>
         <w:numPr>
           <w:ilvl w:val="0"/>
-          <w:numId w:val="1002"/>
+          <w:numId w:val="1003"/>
         </w:numPr>
       </w:pPr>
-      <w:hyperlink r:id="rId25">
+      <w:hyperlink r:id="rId28">
         <w:r>
           <w:rPr>
             <w:rStyle w:val="Hyperlink"/>
@@ -616,10 +682,10 @@
       <w:pPr>
         <w:numPr>
           <w:ilvl w:val="0"/>
-          <w:numId w:val="1002"/>
+          <w:numId w:val="1003"/>
         </w:numPr>
       </w:pPr>
-      <w:hyperlink r:id="rId26">
+      <w:hyperlink r:id="rId29">
         <w:r>
           <w:rPr>
             <w:rStyle w:val="Hyperlink"/>
@@ -648,7 +714,7 @@
       <w:r>
         <w:t xml:space="preserve"> </w:t>
       </w:r>
-      <w:hyperlink r:id="rId27">
+      <w:hyperlink r:id="rId30">
         <w:r>
           <w:rPr>
             <w:rStyle w:val="Hyperlink"/>
@@ -674,7 +740,7 @@
       <w:r>
         <w:t xml:space="preserve"> </w:t>
       </w:r>
-      <w:hyperlink r:id="rId28">
+      <w:hyperlink r:id="rId31">
         <w:r>
           <w:rPr>
             <w:rStyle w:val="Hyperlink"/>
@@ -709,7 +775,7 @@
       <w:r>
         <w:t xml:space="preserve"> </w:t>
       </w:r>
-      <w:hyperlink r:id="rId19">
+      <w:hyperlink r:id="rId22">
         <w:r>
           <w:rPr>
             <w:rStyle w:val="Hyperlink"/>
@@ -726,7 +792,7 @@
       <w:r>
         <w:t xml:space="preserve"> </w:t>
       </w:r>
-      <w:hyperlink r:id="rId20">
+      <w:hyperlink r:id="rId23">
         <w:r>
           <w:rPr>
             <w:rStyle w:val="Hyperlink"/>
@@ -745,10 +811,10 @@
       <w:pPr>
         <w:numPr>
           <w:ilvl w:val="0"/>
-          <w:numId w:val="1002"/>
+          <w:numId w:val="1003"/>
         </w:numPr>
       </w:pPr>
-      <w:hyperlink r:id="rId29">
+      <w:hyperlink r:id="rId32">
         <w:r>
           <w:rPr>
             <w:rStyle w:val="Hyperlink"/>
@@ -783,7 +849,7 @@
       <w:r>
         <w:t xml:space="preserve"> </w:t>
       </w:r>
-      <w:hyperlink r:id="rId15">
+      <w:hyperlink r:id="rId18">
         <w:r>
           <w:rPr>
             <w:rStyle w:val="Hyperlink"/>
@@ -800,7 +866,7 @@
       <w:r>
         <w:t xml:space="preserve"> </w:t>
       </w:r>
-      <w:hyperlink r:id="rId20">
+      <w:hyperlink r:id="rId23">
         <w:r>
           <w:rPr>
             <w:rStyle w:val="Hyperlink"/>
@@ -825,10 +891,10 @@
       <w:pPr>
         <w:numPr>
           <w:ilvl w:val="0"/>
-          <w:numId w:val="1002"/>
+          <w:numId w:val="1003"/>
         </w:numPr>
       </w:pPr>
-      <w:hyperlink r:id="rId30">
+      <w:hyperlink r:id="rId33">
         <w:r>
           <w:rPr>
             <w:rStyle w:val="Hyperlink"/>
@@ -854,10 +920,10 @@
         <w:pStyle w:val="Compact"/>
         <w:numPr>
           <w:ilvl w:val="1"/>
-          <w:numId w:val="1003"/>
+          <w:numId w:val="1004"/>
         </w:numPr>
       </w:pPr>
-      <w:hyperlink r:id="rId31">
+      <w:hyperlink r:id="rId34">
         <w:r>
           <w:rPr>
             <w:rStyle w:val="Hyperlink"/>
@@ -874,7 +940,7 @@
       <w:r>
         <w:t xml:space="preserve"> </w:t>
       </w:r>
-      <w:hyperlink r:id="rId19">
+      <w:hyperlink r:id="rId22">
         <w:r>
           <w:rPr>
             <w:rStyle w:val="Hyperlink"/>
@@ -894,10 +960,10 @@
         <w:pStyle w:val="Compact"/>
         <w:numPr>
           <w:ilvl w:val="1"/>
-          <w:numId w:val="1003"/>
+          <w:numId w:val="1004"/>
         </w:numPr>
       </w:pPr>
-      <w:hyperlink r:id="rId32">
+      <w:hyperlink r:id="rId35">
         <w:r>
           <w:rPr>
             <w:rStyle w:val="Hyperlink"/>
@@ -914,7 +980,7 @@
       <w:r>
         <w:t xml:space="preserve"> </w:t>
       </w:r>
-      <w:hyperlink r:id="rId15">
+      <w:hyperlink r:id="rId18">
         <w:r>
           <w:rPr>
             <w:rStyle w:val="Hyperlink"/>
@@ -934,10 +1000,10 @@
         <w:pStyle w:val="Compact"/>
         <w:numPr>
           <w:ilvl w:val="1"/>
-          <w:numId w:val="1003"/>
+          <w:numId w:val="1004"/>
         </w:numPr>
       </w:pPr>
-      <w:hyperlink r:id="rId33">
+      <w:hyperlink r:id="rId36">
         <w:r>
           <w:rPr>
             <w:rStyle w:val="Hyperlink"/>
@@ -954,7 +1020,7 @@
       <w:r>
         <w:t xml:space="preserve"> </w:t>
       </w:r>
-      <w:hyperlink r:id="rId20">
+      <w:hyperlink r:id="rId23">
         <w:r>
           <w:rPr>
             <w:rStyle w:val="Hyperlink"/>
@@ -971,7 +1037,7 @@
       <w:r>
         <w:t xml:space="preserve"> </w:t>
       </w:r>
-      <w:hyperlink r:id="rId21">
+      <w:hyperlink r:id="rId24">
         <w:r>
           <w:rPr>
             <w:rStyle w:val="Hyperlink"/>
@@ -986,8 +1052,8 @@
         <w:t xml:space="preserve">pages.</w:t>
       </w:r>
     </w:p>
-    <w:bookmarkEnd w:id="34"/>
-    <w:bookmarkStart w:id="35" w:name="using-these-notes-in-another-site"/>
+    <w:bookmarkEnd w:id="37"/>
+    <w:bookmarkStart w:id="38" w:name="using-these-notes-in-another-site"/>
     <w:p>
       <w:pPr>
         <w:pStyle w:val="Heading2"/>
@@ -1208,12 +1274,12 @@
             <w:pPr>
               <w:pStyle w:val="Compact"/>
             </w:pPr>
-            <w:hyperlink r:id="rId11">
+            <w:hyperlink r:id="rId12">
               <w:r>
                 <w:rPr>
                   <w:rStyle w:val="Hyperlink"/>
                 </w:rPr>
-                <w:t xml:space="preserve">Sets and Functions</w:t>
+                <w:t xml:space="preserve">Sets</w:t>
               </w:r>
             </w:hyperlink>
           </w:p>
@@ -1228,7 +1294,7 @@
               <w:rPr>
                 <w:rStyle w:val="VerbatimChar"/>
               </w:rPr>
-              <w:t xml:space="preserve">mds/_sets-functions.qmd</w:t>
+              <w:t xml:space="preserve">mds/_sets.qmd</w:t>
             </w:r>
           </w:p>
         </w:tc>
@@ -1240,7 +1306,71 @@
             <w:pPr>
               <w:pStyle w:val="Compact"/>
             </w:pPr>
-            <w:hyperlink r:id="rId12">
+            <w:hyperlink r:id="rId13">
+              <w:r>
+                <w:rPr>
+                  <w:rStyle w:val="Hyperlink"/>
+                </w:rPr>
+                <w:t xml:space="preserve">Functions</w:t>
+              </w:r>
+            </w:hyperlink>
+          </w:p>
+        </w:tc>
+        <w:tc>
+          <w:tcPr/>
+          <w:p>
+            <w:pPr>
+              <w:pStyle w:val="Compact"/>
+            </w:pPr>
+            <w:r>
+              <w:rPr>
+                <w:rStyle w:val="VerbatimChar"/>
+              </w:rPr>
+              <w:t xml:space="preserve">mds/_functions.qmd</w:t>
+            </w:r>
+          </w:p>
+        </w:tc>
+      </w:tr>
+      <w:tr>
+        <w:tc>
+          <w:tcPr/>
+          <w:p>
+            <w:pPr>
+              <w:pStyle w:val="Compact"/>
+            </w:pPr>
+            <w:hyperlink r:id="rId14">
+              <w:r>
+                <w:rPr>
+                  <w:rStyle w:val="Hyperlink"/>
+                </w:rPr>
+                <w:t xml:space="preserve">Expressions and Algorithms</w:t>
+              </w:r>
+            </w:hyperlink>
+          </w:p>
+        </w:tc>
+        <w:tc>
+          <w:tcPr/>
+          <w:p>
+            <w:pPr>
+              <w:pStyle w:val="Compact"/>
+            </w:pPr>
+            <w:r>
+              <w:rPr>
+                <w:rStyle w:val="VerbatimChar"/>
+              </w:rPr>
+              <w:t xml:space="preserve">mds/_expressions-algorithms.qmd</w:t>
+            </w:r>
+          </w:p>
+        </w:tc>
+      </w:tr>
+      <w:tr>
+        <w:tc>
+          <w:tcPr/>
+          <w:p>
+            <w:pPr>
+              <w:pStyle w:val="Compact"/>
+            </w:pPr>
+            <w:hyperlink r:id="rId15">
               <w:r>
                 <w:rPr>
                   <w:rStyle w:val="Hyperlink"/>
@@ -1272,7 +1402,7 @@
             <w:pPr>
               <w:pStyle w:val="Compact"/>
             </w:pPr>
-            <w:hyperlink r:id="rId14">
+            <w:hyperlink r:id="rId17">
               <w:r>
                 <w:rPr>
                   <w:rStyle w:val="Hyperlink"/>
@@ -1304,7 +1434,7 @@
             <w:pPr>
               <w:pStyle w:val="Compact"/>
             </w:pPr>
-            <w:hyperlink r:id="rId15">
+            <w:hyperlink r:id="rId18">
               <w:r>
                 <w:rPr>
                   <w:rStyle w:val="Hyperlink"/>
@@ -1360,7 +1490,7 @@
             <w:pPr>
               <w:pStyle w:val="Compact"/>
             </w:pPr>
-            <w:hyperlink r:id="rId19">
+            <w:hyperlink r:id="rId22">
               <w:r>
                 <w:rPr>
                   <w:rStyle w:val="Hyperlink"/>
@@ -1392,7 +1522,7 @@
             <w:pPr>
               <w:pStyle w:val="Compact"/>
             </w:pPr>
-            <w:hyperlink r:id="rId20">
+            <w:hyperlink r:id="rId23">
               <w:r>
                 <w:rPr>
                   <w:rStyle w:val="Hyperlink"/>
@@ -1424,7 +1554,7 @@
             <w:pPr>
               <w:pStyle w:val="Compact"/>
             </w:pPr>
-            <w:hyperlink r:id="rId21">
+            <w:hyperlink r:id="rId24">
               <w:r>
                 <w:rPr>
                   <w:rStyle w:val="Hyperlink"/>
@@ -1456,7 +1586,7 @@
             <w:pPr>
               <w:pStyle w:val="Compact"/>
             </w:pPr>
-            <w:hyperlink r:id="rId22">
+            <w:hyperlink r:id="rId25">
               <w:r>
                 <w:rPr>
                   <w:rStyle w:val="Hyperlink"/>
@@ -1514,7 +1644,31 @@
         <w:rPr>
           <w:rStyle w:val="VerbatimChar"/>
         </w:rPr>
-        <w:t xml:space="preserve">_sets-functions.qmd</w:t>
+        <w:t xml:space="preserve">_sets.qmd</w:t>
+      </w:r>
+      <w:r>
+        <w:t xml:space="preserve">,</w:t>
+      </w:r>
+      <w:r>
+        <w:t xml:space="preserve"> </w:t>
+      </w:r>
+      <w:r>
+        <w:rPr>
+          <w:rStyle w:val="VerbatimChar"/>
+        </w:rPr>
+        <w:t xml:space="preserve">_functions.qmd</w:t>
+      </w:r>
+      <w:r>
+        <w:t xml:space="preserve">,</w:t>
+      </w:r>
+      <w:r>
+        <w:t xml:space="preserve"> </w:t>
+      </w:r>
+      <w:r>
+        <w:rPr>
+          <w:rStyle w:val="VerbatimChar"/>
+        </w:rPr>
+        <w:t xml:space="preserve">_expressions-algorithms.qmd</w:t>
       </w:r>
       <w:r>
         <w:t xml:space="preserve">,</w:t>
@@ -1654,8 +1808,8 @@
         <w:t xml:space="preserve">.</w:t>
       </w:r>
     </w:p>
-    <w:bookmarkEnd w:id="35"/>
-    <w:bookmarkStart w:id="39" w:name="references"/>
+    <w:bookmarkEnd w:id="38"/>
+    <w:bookmarkStart w:id="42" w:name="references"/>
     <w:p>
       <w:pPr>
         <w:pStyle w:val="Heading2"/>
@@ -1664,8 +1818,8 @@
         <w:t xml:space="preserve">References</w:t>
       </w:r>
     </w:p>
-    <w:bookmarkStart w:id="38" w:name="refs"/>
-    <w:bookmarkStart w:id="37" w:name="ref-cheng2025math"/>
+    <w:bookmarkStart w:id="41" w:name="refs"/>
+    <w:bookmarkStart w:id="40" w:name="ref-cheng2025math"/>
     <w:p>
       <w:pPr>
         <w:pStyle w:val="Bibliography"/>
@@ -1707,7 +1861,7 @@
       <w:r>
         <w:t xml:space="preserve"> </w:t>
       </w:r>
-      <w:hyperlink r:id="rId36">
+      <w:hyperlink r:id="rId39">
         <w:r>
           <w:rPr>
             <w:rStyle w:val="Hyperlink"/>
@@ -1719,9 +1873,9 @@
         <w:t xml:space="preserve">.</w:t>
       </w:r>
     </w:p>
-    <w:bookmarkEnd w:id="37"/>
-    <w:bookmarkEnd w:id="38"/>
-    <w:bookmarkEnd w:id="39"/>
+    <w:bookmarkEnd w:id="40"/>
+    <w:bookmarkEnd w:id="41"/>
+    <w:bookmarkEnd w:id="42"/>
     <w:sectPr>
       <w:footnotePr>
         <w:numRestart w:val="eachSect"/>
@@ -1945,6 +2099,9 @@
     <w:abstractNumId w:val="991"/>
   </w:num>
   <w:num w:numId="1003">
+    <w:abstractNumId w:val="991"/>
+  </w:num>
+  <w:num w:numId="1004">
     <w:abstractNumId w:val="991"/>
   </w:num>
 </w:numbering>

</xml_diff>

<commit_message>
Deploying to gh-pages from @ Morrison-Lab/mds@2953356b112d09001e59332948d7ded2d7c03051 🚀
</commit_message>
<xml_diff>
--- a/index.docx
+++ b/index.docx
@@ -15,7 +15,7 @@
         <w:pStyle w:val="Date"/>
       </w:pPr>
       <w:r>
-        <w:t xml:space="preserve">Last modified: 2026-10-15 19:41:40 (PDT)</w:t>
+        <w:t xml:space="preserve">Last modified: 2026-10-15 20:43:22 (PDT)</w:t>
       </w:r>
     </w:p>
     <w:bookmarkStart w:id="27" w:name="welcome"/>
@@ -316,7 +316,7 @@
         <w:t xml:space="preserve"> </w:t>
       </w:r>
       <w:r>
-        <w:t xml:space="preserve">percent, sums, products, quotients, exponentials and logarithms</w:t>
+        <w:t xml:space="preserve">percent, sums, products, quotients, limits of sums, notational shorthands, exponentials and logarithms</w:t>
       </w:r>
     </w:p>
     <w:p>

</xml_diff>

<commit_message>
Deploying to gh-pages from @ Morrison-Lab/mds@2f64e89af5c9aedf6b864e199b4dc4886e5609dd 🚀
</commit_message>
<xml_diff>
--- a/index.docx
+++ b/index.docx
@@ -15,10 +15,10 @@
         <w:pStyle w:val="Date"/>
       </w:pPr>
       <w:r>
-        <w:t xml:space="preserve">Last modified: 2026-10-15 20:43:22 (PDT)</w:t>
-      </w:r>
-    </w:p>
-    <w:bookmarkStart w:id="27" w:name="welcome"/>
+        <w:t xml:space="preserve">Last modified: 2026-10-15 21:43:14 (PDT)</w:t>
+      </w:r>
+    </w:p>
+    <w:bookmarkStart w:id="28" w:name="welcome"/>
     <w:p>
       <w:pPr>
         <w:pStyle w:val="Heading2"/>
@@ -124,12 +124,6 @@
       <w:r>
         <w:t xml:space="preserve">common symbols</w:t>
       </w:r>
-      <w:r>
-        <w:t xml:space="preserve"> </w:t>
-      </w:r>
-      <w:r>
-        <w:t xml:space="preserve">and indicator functions</w:t>
-      </w:r>
     </w:p>
     <w:p>
       <w:pPr>
@@ -176,6 +170,38 @@
           <w:rPr>
             <w:rStyle w:val="Hyperlink"/>
           </w:rPr>
+          <w:t xml:space="preserve">Indicator Functions</w:t>
+        </w:r>
+      </w:hyperlink>
+      <w:r>
+        <w:t xml:space="preserve">:</w:t>
+      </w:r>
+      <w:r>
+        <w:t xml:space="preserve"> </w:t>
+      </w:r>
+      <w:r>
+        <w:t xml:space="preserve">set and predicate indicators, the Iverson bracket, the Kronecker delta,</w:t>
+      </w:r>
+      <w:r>
+        <w:t xml:space="preserve"> </w:t>
+      </w:r>
+      <w:r>
+        <w:t xml:space="preserve">and their algebraic properties</w:t>
+      </w:r>
+    </w:p>
+    <w:p>
+      <w:pPr>
+        <w:pStyle w:val="Compact"/>
+        <w:numPr>
+          <w:ilvl w:val="0"/>
+          <w:numId w:val="1001"/>
+        </w:numPr>
+      </w:pPr>
+      <w:hyperlink r:id="rId12">
+        <w:r>
+          <w:rPr>
+            <w:rStyle w:val="Hyperlink"/>
+          </w:rPr>
           <w:t xml:space="preserve">Sets and Functions</w:t>
         </w:r>
       </w:hyperlink>
@@ -191,7 +217,7 @@
           <w:numId w:val="1002"/>
         </w:numPr>
       </w:pPr>
-      <w:hyperlink r:id="rId12">
+      <w:hyperlink r:id="rId13">
         <w:r>
           <w:rPr>
             <w:rStyle w:val="Hyperlink"/>
@@ -229,7 +255,7 @@
           <w:numId w:val="1002"/>
         </w:numPr>
       </w:pPr>
-      <w:hyperlink r:id="rId13">
+      <w:hyperlink r:id="rId14">
         <w:r>
           <w:rPr>
             <w:rStyle w:val="Hyperlink"/>
@@ -255,7 +281,7 @@
           <w:numId w:val="1002"/>
         </w:numPr>
       </w:pPr>
-      <w:hyperlink r:id="rId14">
+      <w:hyperlink r:id="rId15">
         <w:r>
           <w:rPr>
             <w:rStyle w:val="Hyperlink"/>
@@ -281,7 +307,7 @@
           <w:numId w:val="1001"/>
         </w:numPr>
       </w:pPr>
-      <w:hyperlink r:id="rId15">
+      <w:hyperlink r:id="rId16">
         <w:r>
           <w:rPr>
             <w:rStyle w:val="Hyperlink"/>
@@ -301,7 +327,7 @@
       <w:r>
         <w:t xml:space="preserve"> </w:t>
       </w:r>
-      <w:hyperlink r:id="rId16">
+      <w:hyperlink r:id="rId17">
         <w:r>
           <w:rPr>
             <w:rStyle w:val="Hyperlink"/>
@@ -327,7 +353,7 @@
           <w:numId w:val="1001"/>
         </w:numPr>
       </w:pPr>
-      <w:hyperlink r:id="rId17">
+      <w:hyperlink r:id="rId18">
         <w:r>
           <w:rPr>
             <w:rStyle w:val="Hyperlink"/>
@@ -364,7 +390,7 @@
           <w:numId w:val="1001"/>
         </w:numPr>
       </w:pPr>
-      <w:hyperlink r:id="rId18">
+      <w:hyperlink r:id="rId19">
         <w:r>
           <w:rPr>
             <w:rStyle w:val="Hyperlink"/>
@@ -390,7 +416,7 @@
       <w:r>
         <w:t xml:space="preserve"> </w:t>
       </w:r>
-      <w:hyperlink r:id="rId19">
+      <w:hyperlink r:id="rId20">
         <w:r>
           <w:rPr>
             <w:rStyle w:val="Hyperlink"/>
@@ -404,7 +430,7 @@
       <w:r>
         <w:t xml:space="preserve"> </w:t>
       </w:r>
-      <w:hyperlink r:id="rId20">
+      <w:hyperlink r:id="rId21">
         <w:r>
           <w:rPr>
             <w:rStyle w:val="Hyperlink"/>
@@ -424,7 +450,7 @@
       <w:r>
         <w:t xml:space="preserve"> </w:t>
       </w:r>
-      <w:hyperlink r:id="rId21">
+      <w:hyperlink r:id="rId22">
         <w:r>
           <w:rPr>
             <w:rStyle w:val="Hyperlink"/>
@@ -453,7 +479,7 @@
           <w:numId w:val="1001"/>
         </w:numPr>
       </w:pPr>
-      <w:hyperlink r:id="rId22">
+      <w:hyperlink r:id="rId23">
         <w:r>
           <w:rPr>
             <w:rStyle w:val="Hyperlink"/>
@@ -491,7 +517,7 @@
           <w:numId w:val="1001"/>
         </w:numPr>
       </w:pPr>
-      <w:hyperlink r:id="rId23">
+      <w:hyperlink r:id="rId24">
         <w:r>
           <w:rPr>
             <w:rStyle w:val="Hyperlink"/>
@@ -523,7 +549,7 @@
           <w:numId w:val="1001"/>
         </w:numPr>
       </w:pPr>
-      <w:hyperlink r:id="rId24">
+      <w:hyperlink r:id="rId25">
         <w:r>
           <w:rPr>
             <w:rStyle w:val="Hyperlink"/>
@@ -555,7 +581,7 @@
           <w:numId w:val="1001"/>
         </w:numPr>
       </w:pPr>
-      <w:hyperlink r:id="rId25">
+      <w:hyperlink r:id="rId26">
         <w:r>
           <w:rPr>
             <w:rStyle w:val="Hyperlink"/>
@@ -575,7 +601,7 @@
       <w:r>
         <w:t xml:space="preserve"> </w:t>
       </w:r>
-      <w:hyperlink r:id="rId26">
+      <w:hyperlink r:id="rId27">
         <w:r>
           <w:rPr>
             <w:rStyle w:val="Hyperlink"/>
@@ -584,8 +610,8 @@
         </w:r>
       </w:hyperlink>
     </w:p>
-    <w:bookmarkEnd w:id="27"/>
-    <w:bookmarkStart w:id="37" w:name="further-reading"/>
+    <w:bookmarkEnd w:id="28"/>
+    <w:bookmarkStart w:id="38" w:name="further-reading"/>
     <w:p>
       <w:pPr>
         <w:pStyle w:val="Heading2"/>
@@ -609,7 +635,7 @@
           <w:numId w:val="1003"/>
         </w:numPr>
       </w:pPr>
-      <w:hyperlink r:id="rId28">
+      <w:hyperlink r:id="rId29">
         <w:r>
           <w:rPr>
             <w:rStyle w:val="Hyperlink"/>
@@ -685,7 +711,7 @@
           <w:numId w:val="1003"/>
         </w:numPr>
       </w:pPr>
-      <w:hyperlink r:id="rId29">
+      <w:hyperlink r:id="rId30">
         <w:r>
           <w:rPr>
             <w:rStyle w:val="Hyperlink"/>
@@ -714,7 +740,7 @@
       <w:r>
         <w:t xml:space="preserve"> </w:t>
       </w:r>
-      <w:hyperlink r:id="rId30">
+      <w:hyperlink r:id="rId31">
         <w:r>
           <w:rPr>
             <w:rStyle w:val="Hyperlink"/>
@@ -740,7 +766,7 @@
       <w:r>
         <w:t xml:space="preserve"> </w:t>
       </w:r>
-      <w:hyperlink r:id="rId31">
+      <w:hyperlink r:id="rId32">
         <w:r>
           <w:rPr>
             <w:rStyle w:val="Hyperlink"/>
@@ -775,7 +801,7 @@
       <w:r>
         <w:t xml:space="preserve"> </w:t>
       </w:r>
-      <w:hyperlink r:id="rId22">
+      <w:hyperlink r:id="rId23">
         <w:r>
           <w:rPr>
             <w:rStyle w:val="Hyperlink"/>
@@ -792,7 +818,7 @@
       <w:r>
         <w:t xml:space="preserve"> </w:t>
       </w:r>
-      <w:hyperlink r:id="rId23">
+      <w:hyperlink r:id="rId24">
         <w:r>
           <w:rPr>
             <w:rStyle w:val="Hyperlink"/>
@@ -814,7 +840,7 @@
           <w:numId w:val="1003"/>
         </w:numPr>
       </w:pPr>
-      <w:hyperlink r:id="rId32">
+      <w:hyperlink r:id="rId33">
         <w:r>
           <w:rPr>
             <w:rStyle w:val="Hyperlink"/>
@@ -849,7 +875,7 @@
       <w:r>
         <w:t xml:space="preserve"> </w:t>
       </w:r>
-      <w:hyperlink r:id="rId18">
+      <w:hyperlink r:id="rId19">
         <w:r>
           <w:rPr>
             <w:rStyle w:val="Hyperlink"/>
@@ -866,7 +892,7 @@
       <w:r>
         <w:t xml:space="preserve"> </w:t>
       </w:r>
-      <w:hyperlink r:id="rId23">
+      <w:hyperlink r:id="rId24">
         <w:r>
           <w:rPr>
             <w:rStyle w:val="Hyperlink"/>
@@ -894,7 +920,7 @@
           <w:numId w:val="1003"/>
         </w:numPr>
       </w:pPr>
-      <w:hyperlink r:id="rId33">
+      <w:hyperlink r:id="rId34">
         <w:r>
           <w:rPr>
             <w:rStyle w:val="Hyperlink"/>
@@ -923,7 +949,7 @@
           <w:numId w:val="1004"/>
         </w:numPr>
       </w:pPr>
-      <w:hyperlink r:id="rId34">
+      <w:hyperlink r:id="rId35">
         <w:r>
           <w:rPr>
             <w:rStyle w:val="Hyperlink"/>
@@ -940,7 +966,7 @@
       <w:r>
         <w:t xml:space="preserve"> </w:t>
       </w:r>
-      <w:hyperlink r:id="rId22">
+      <w:hyperlink r:id="rId23">
         <w:r>
           <w:rPr>
             <w:rStyle w:val="Hyperlink"/>
@@ -963,7 +989,7 @@
           <w:numId w:val="1004"/>
         </w:numPr>
       </w:pPr>
-      <w:hyperlink r:id="rId35">
+      <w:hyperlink r:id="rId36">
         <w:r>
           <w:rPr>
             <w:rStyle w:val="Hyperlink"/>
@@ -980,7 +1006,7 @@
       <w:r>
         <w:t xml:space="preserve"> </w:t>
       </w:r>
-      <w:hyperlink r:id="rId18">
+      <w:hyperlink r:id="rId19">
         <w:r>
           <w:rPr>
             <w:rStyle w:val="Hyperlink"/>
@@ -1003,7 +1029,7 @@
           <w:numId w:val="1004"/>
         </w:numPr>
       </w:pPr>
-      <w:hyperlink r:id="rId36">
+      <w:hyperlink r:id="rId37">
         <w:r>
           <w:rPr>
             <w:rStyle w:val="Hyperlink"/>
@@ -1020,7 +1046,7 @@
       <w:r>
         <w:t xml:space="preserve"> </w:t>
       </w:r>
-      <w:hyperlink r:id="rId23">
+      <w:hyperlink r:id="rId24">
         <w:r>
           <w:rPr>
             <w:rStyle w:val="Hyperlink"/>
@@ -1037,7 +1063,7 @@
       <w:r>
         <w:t xml:space="preserve"> </w:t>
       </w:r>
-      <w:hyperlink r:id="rId24">
+      <w:hyperlink r:id="rId25">
         <w:r>
           <w:rPr>
             <w:rStyle w:val="Hyperlink"/>
@@ -1052,8 +1078,8 @@
         <w:t xml:space="preserve">pages.</w:t>
       </w:r>
     </w:p>
-    <w:bookmarkEnd w:id="37"/>
-    <w:bookmarkStart w:id="38" w:name="using-these-notes-in-another-site"/>
+    <w:bookmarkEnd w:id="38"/>
+    <w:bookmarkStart w:id="39" w:name="using-these-notes-in-another-site"/>
     <w:p>
       <w:pPr>
         <w:pStyle w:val="Heading2"/>
@@ -1274,7 +1300,39 @@
             <w:pPr>
               <w:pStyle w:val="Compact"/>
             </w:pPr>
-            <w:hyperlink r:id="rId12">
+            <w:hyperlink r:id="rId11">
+              <w:r>
+                <w:rPr>
+                  <w:rStyle w:val="Hyperlink"/>
+                </w:rPr>
+                <w:t xml:space="preserve">Indicator Functions</w:t>
+              </w:r>
+            </w:hyperlink>
+          </w:p>
+        </w:tc>
+        <w:tc>
+          <w:tcPr/>
+          <w:p>
+            <w:pPr>
+              <w:pStyle w:val="Compact"/>
+            </w:pPr>
+            <w:r>
+              <w:rPr>
+                <w:rStyle w:val="VerbatimChar"/>
+              </w:rPr>
+              <w:t xml:space="preserve">mds/_indicator-functions.qmd</w:t>
+            </w:r>
+          </w:p>
+        </w:tc>
+      </w:tr>
+      <w:tr>
+        <w:tc>
+          <w:tcPr/>
+          <w:p>
+            <w:pPr>
+              <w:pStyle w:val="Compact"/>
+            </w:pPr>
+            <w:hyperlink r:id="rId13">
               <w:r>
                 <w:rPr>
                   <w:rStyle w:val="Hyperlink"/>
@@ -1306,7 +1364,7 @@
             <w:pPr>
               <w:pStyle w:val="Compact"/>
             </w:pPr>
-            <w:hyperlink r:id="rId13">
+            <w:hyperlink r:id="rId14">
               <w:r>
                 <w:rPr>
                   <w:rStyle w:val="Hyperlink"/>
@@ -1338,7 +1396,7 @@
             <w:pPr>
               <w:pStyle w:val="Compact"/>
             </w:pPr>
-            <w:hyperlink r:id="rId14">
+            <w:hyperlink r:id="rId15">
               <w:r>
                 <w:rPr>
                   <w:rStyle w:val="Hyperlink"/>
@@ -1370,7 +1428,7 @@
             <w:pPr>
               <w:pStyle w:val="Compact"/>
             </w:pPr>
-            <w:hyperlink r:id="rId15">
+            <w:hyperlink r:id="rId16">
               <w:r>
                 <w:rPr>
                   <w:rStyle w:val="Hyperlink"/>
@@ -1402,7 +1460,7 @@
             <w:pPr>
               <w:pStyle w:val="Compact"/>
             </w:pPr>
-            <w:hyperlink r:id="rId17">
+            <w:hyperlink r:id="rId18">
               <w:r>
                 <w:rPr>
                   <w:rStyle w:val="Hyperlink"/>
@@ -1434,7 +1492,7 @@
             <w:pPr>
               <w:pStyle w:val="Compact"/>
             </w:pPr>
-            <w:hyperlink r:id="rId18">
+            <w:hyperlink r:id="rId19">
               <w:r>
                 <w:rPr>
                   <w:rStyle w:val="Hyperlink"/>
@@ -1490,7 +1548,7 @@
             <w:pPr>
               <w:pStyle w:val="Compact"/>
             </w:pPr>
-            <w:hyperlink r:id="rId22">
+            <w:hyperlink r:id="rId23">
               <w:r>
                 <w:rPr>
                   <w:rStyle w:val="Hyperlink"/>
@@ -1522,7 +1580,7 @@
             <w:pPr>
               <w:pStyle w:val="Compact"/>
             </w:pPr>
-            <w:hyperlink r:id="rId23">
+            <w:hyperlink r:id="rId24">
               <w:r>
                 <w:rPr>
                   <w:rStyle w:val="Hyperlink"/>
@@ -1554,7 +1612,7 @@
             <w:pPr>
               <w:pStyle w:val="Compact"/>
             </w:pPr>
-            <w:hyperlink r:id="rId24">
+            <w:hyperlink r:id="rId25">
               <w:r>
                 <w:rPr>
                   <w:rStyle w:val="Hyperlink"/>
@@ -1586,7 +1644,7 @@
             <w:pPr>
               <w:pStyle w:val="Compact"/>
             </w:pPr>
-            <w:hyperlink r:id="rId25">
+            <w:hyperlink r:id="rId26">
               <w:r>
                 <w:rPr>
                   <w:rStyle w:val="Hyperlink"/>
@@ -1644,6 +1702,18 @@
         <w:rPr>
           <w:rStyle w:val="VerbatimChar"/>
         </w:rPr>
+        <w:t xml:space="preserve">_indicator-functions.qmd</w:t>
+      </w:r>
+      <w:r>
+        <w:t xml:space="preserve">,</w:t>
+      </w:r>
+      <w:r>
+        <w:t xml:space="preserve"> </w:t>
+      </w:r>
+      <w:r>
+        <w:rPr>
+          <w:rStyle w:val="VerbatimChar"/>
+        </w:rPr>
         <w:t xml:space="preserve">_sets.qmd</w:t>
       </w:r>
       <w:r>
@@ -1808,8 +1878,8 @@
         <w:t xml:space="preserve">.</w:t>
       </w:r>
     </w:p>
-    <w:bookmarkEnd w:id="38"/>
-    <w:bookmarkStart w:id="42" w:name="references"/>
+    <w:bookmarkEnd w:id="39"/>
+    <w:bookmarkStart w:id="43" w:name="references"/>
     <w:p>
       <w:pPr>
         <w:pStyle w:val="Heading2"/>
@@ -1818,8 +1888,8 @@
         <w:t xml:space="preserve">References</w:t>
       </w:r>
     </w:p>
-    <w:bookmarkStart w:id="41" w:name="refs"/>
-    <w:bookmarkStart w:id="40" w:name="ref-cheng2025math"/>
+    <w:bookmarkStart w:id="42" w:name="refs"/>
+    <w:bookmarkStart w:id="41" w:name="ref-cheng2025math"/>
     <w:p>
       <w:pPr>
         <w:pStyle w:val="Bibliography"/>
@@ -1861,7 +1931,7 @@
       <w:r>
         <w:t xml:space="preserve"> </w:t>
       </w:r>
-      <w:hyperlink r:id="rId39">
+      <w:hyperlink r:id="rId40">
         <w:r>
           <w:rPr>
             <w:rStyle w:val="Hyperlink"/>
@@ -1873,9 +1943,9 @@
         <w:t xml:space="preserve">.</w:t>
       </w:r>
     </w:p>
-    <w:bookmarkEnd w:id="40"/>
     <w:bookmarkEnd w:id="41"/>
     <w:bookmarkEnd w:id="42"/>
+    <w:bookmarkEnd w:id="43"/>
     <w:sectPr>
       <w:footnotePr>
         <w:numRestart w:val="eachSect"/>

</xml_diff>